<commit_message>
feat:integrate docx report generation and refine analysis workflow - **Report Generator**: Refactored  to generate  files using a new , moving away from markdown-based templates. - **Workflow & Prompts**: Added new system prompts for  and . Updated the AWS Step Functions state machine () and SAM  to align with the new analysis process. - **S3 & Storage**: Cleaned up  and added job progress functionality in . - **Frontend**: Updated  and  to handle the new document generation states and outputs. - **Testing**: Introduced comprehensive smoke tests () and template filler tests () with new  and  fixtures. - **Clean up**: Removed obsolete markdown templates (, , ) and updated CI/CD workflows.
</commit_message>
<xml_diff>
--- a/template/CreditIQ_Template_EEFF.docx
+++ b/template/CreditIQ_Template_EEFF.docx
@@ -13,7 +13,76 @@
     <w:p>
       <w:pPr>
         <w:spacing w:before="320" w:after="60"/>
+        <w:jc w:val="center"/>
       </w:pPr>
+      <w:r>
+        <w:rPr>
+          <w:b/>
+          <w:bCs/>
+          <w:noProof/>
+          <w:color w:val="1B2A4A"/>
+          <w:sz w:val="36"/>
+          <w:szCs w:val="36"/>
+        </w:rPr>
+        <w:drawing>
+          <wp:anchor distT="0" distB="0" distL="114300" distR="114300" simplePos="0" relativeHeight="251658240" behindDoc="0" locked="0" layoutInCell="1" allowOverlap="1" wp14:anchorId="3A8AACB4" wp14:editId="3C67E853">
+            <wp:simplePos x="0" y="0"/>
+            <wp:positionH relativeFrom="margin">
+              <wp:posOffset>52705</wp:posOffset>
+            </wp:positionH>
+            <wp:positionV relativeFrom="paragraph">
+              <wp:posOffset>62024</wp:posOffset>
+            </wp:positionV>
+            <wp:extent cx="964195" cy="228659"/>
+            <wp:effectExtent l="0" t="0" r="0" b="0"/>
+            <wp:wrapNone/>
+            <wp:docPr id="103962733" name="Imagen 4"/>
+            <wp:cNvGraphicFramePr>
+              <a:graphicFrameLocks xmlns:a="http://schemas.openxmlformats.org/drawingml/2006/main" noChangeAspect="1"/>
+            </wp:cNvGraphicFramePr>
+            <a:graphic xmlns:a="http://schemas.openxmlformats.org/drawingml/2006/main">
+              <a:graphicData uri="http://schemas.openxmlformats.org/drawingml/2006/picture">
+                <pic:pic xmlns:pic="http://schemas.openxmlformats.org/drawingml/2006/picture">
+                  <pic:nvPicPr>
+                    <pic:cNvPr id="103962733" name="Imagen 4"/>
+                    <pic:cNvPicPr/>
+                  </pic:nvPicPr>
+                  <pic:blipFill rotWithShape="1">
+                    <a:blip r:embed="rId7" cstate="print">
+                      <a:extLst>
+                        <a:ext uri="{28A0092B-C50C-407E-A947-70E740481C1C}">
+                          <a14:useLocalDpi xmlns:a14="http://schemas.microsoft.com/office/drawing/2010/main" val="0"/>
+                        </a:ext>
+                      </a:extLst>
+                    </a:blip>
+                    <a:srcRect t="25574" b="26996"/>
+                    <a:stretch>
+                      <a:fillRect/>
+                    </a:stretch>
+                  </pic:blipFill>
+                  <pic:spPr bwMode="auto">
+                    <a:xfrm>
+                      <a:off x="0" y="0"/>
+                      <a:ext cx="964195" cy="228659"/>
+                    </a:xfrm>
+                    <a:prstGeom prst="rect">
+                      <a:avLst/>
+                    </a:prstGeom>
+                    <a:ln>
+                      <a:noFill/>
+                    </a:ln>
+                    <a:extLst>
+                      <a:ext uri="{53640926-AAD7-44D8-BBD7-CCE9431645EC}">
+                        <a14:shadowObscured xmlns:a14="http://schemas.microsoft.com/office/drawing/2010/main"/>
+                      </a:ext>
+                    </a:extLst>
+                  </pic:spPr>
+                </pic:pic>
+              </a:graphicData>
+            </a:graphic>
+          </wp:anchor>
+        </w:drawing>
+      </w:r>
       <w:r>
         <w:rPr>
           <w:b/>
@@ -22,20 +91,25 @@
           <w:sz w:val="36"/>
           <w:szCs w:val="36"/>
         </w:rPr>
-        <w:t>CREDITIQ — REPORTE DE ANÁLISIS FINANCIERO</w:t>
+        <w:t>REPORTE DE ANÁLISIS FINANCIERO</w:t>
       </w:r>
     </w:p>
     <w:p>
       <w:pPr>
         <w:spacing w:after="60"/>
+        <w:jc w:val="center"/>
+        <w:rPr>
+          <w:sz w:val="14"/>
+          <w:szCs w:val="14"/>
+        </w:rPr>
       </w:pPr>
       <w:r>
         <w:rPr>
           <w:i/>
           <w:iCs/>
           <w:color w:val="2E4A7A"/>
-          <w:sz w:val="22"/>
-          <w:szCs w:val="22"/>
+          <w:sz w:val="16"/>
+          <w:szCs w:val="16"/>
         </w:rPr>
         <w:t xml:space="preserve">Generado automáticamente por el Sistema </w:t>
       </w:r>
@@ -45,8 +119,8 @@
           <w:i/>
           <w:iCs/>
           <w:color w:val="2E4A7A"/>
-          <w:sz w:val="22"/>
-          <w:szCs w:val="22"/>
+          <w:sz w:val="16"/>
+          <w:szCs w:val="16"/>
         </w:rPr>
         <w:t>Multiagente</w:t>
       </w:r>
@@ -56,8 +130,8 @@
           <w:i/>
           <w:iCs/>
           <w:color w:val="2E4A7A"/>
-          <w:sz w:val="22"/>
-          <w:szCs w:val="22"/>
+          <w:sz w:val="16"/>
+          <w:szCs w:val="16"/>
         </w:rPr>
         <w:t xml:space="preserve"> de IA</w:t>
       </w:r>
@@ -98,12 +172,6 @@
         <w:gridCol w:w="2141"/>
       </w:tblGrid>
       <w:tr>
-        <w:tblPrEx>
-          <w:tblCellMar>
-            <w:top w:w="0" w:type="dxa"/>
-            <w:bottom w:w="0" w:type="dxa"/>
-          </w:tblCellMar>
-        </w:tblPrEx>
         <w:tc>
           <w:tcPr>
             <w:tcW w:w="2400" w:type="dxa"/>
@@ -216,12 +284,6 @@
         </w:tc>
       </w:tr>
       <w:tr>
-        <w:tblPrEx>
-          <w:tblCellMar>
-            <w:top w:w="0" w:type="dxa"/>
-            <w:bottom w:w="0" w:type="dxa"/>
-          </w:tblCellMar>
-        </w:tblPrEx>
         <w:tc>
           <w:tcPr>
             <w:tcW w:w="2400" w:type="dxa"/>
@@ -334,12 +396,6 @@
         </w:tc>
       </w:tr>
       <w:tr>
-        <w:tblPrEx>
-          <w:tblCellMar>
-            <w:top w:w="0" w:type="dxa"/>
-            <w:bottom w:w="0" w:type="dxa"/>
-          </w:tblCellMar>
-        </w:tblPrEx>
         <w:tc>
           <w:tcPr>
             <w:tcW w:w="2400" w:type="dxa"/>
@@ -452,12 +508,6 @@
         </w:tc>
       </w:tr>
       <w:tr>
-        <w:tblPrEx>
-          <w:tblCellMar>
-            <w:top w:w="0" w:type="dxa"/>
-            <w:bottom w:w="0" w:type="dxa"/>
-          </w:tblCellMar>
-        </w:tblPrEx>
         <w:tc>
           <w:tcPr>
             <w:tcW w:w="2400" w:type="dxa"/>
@@ -703,12 +753,6 @@
         <w:gridCol w:w="6438"/>
       </w:tblGrid>
       <w:tr>
-        <w:tblPrEx>
-          <w:tblCellMar>
-            <w:top w:w="0" w:type="dxa"/>
-            <w:bottom w:w="0" w:type="dxa"/>
-          </w:tblCellMar>
-        </w:tblPrEx>
         <w:trPr>
           <w:tblHeader/>
         </w:trPr>
@@ -782,12 +826,6 @@
         </w:tc>
       </w:tr>
       <w:tr>
-        <w:tblPrEx>
-          <w:tblCellMar>
-            <w:top w:w="0" w:type="dxa"/>
-            <w:bottom w:w="0" w:type="dxa"/>
-          </w:tblCellMar>
-        </w:tblPrEx>
         <w:tc>
           <w:tcPr>
             <w:tcW w:w="3200" w:type="dxa"/>
@@ -849,12 +887,6 @@
         </w:tc>
       </w:tr>
       <w:tr>
-        <w:tblPrEx>
-          <w:tblCellMar>
-            <w:top w:w="0" w:type="dxa"/>
-            <w:bottom w:w="0" w:type="dxa"/>
-          </w:tblCellMar>
-        </w:tblPrEx>
         <w:tc>
           <w:tcPr>
             <w:tcW w:w="3200" w:type="dxa"/>
@@ -916,12 +948,6 @@
         </w:tc>
       </w:tr>
       <w:tr>
-        <w:tblPrEx>
-          <w:tblCellMar>
-            <w:top w:w="0" w:type="dxa"/>
-            <w:bottom w:w="0" w:type="dxa"/>
-          </w:tblCellMar>
-        </w:tblPrEx>
         <w:tc>
           <w:tcPr>
             <w:tcW w:w="3200" w:type="dxa"/>
@@ -983,12 +1009,6 @@
         </w:tc>
       </w:tr>
       <w:tr>
-        <w:tblPrEx>
-          <w:tblCellMar>
-            <w:top w:w="0" w:type="dxa"/>
-            <w:bottom w:w="0" w:type="dxa"/>
-          </w:tblCellMar>
-        </w:tblPrEx>
         <w:tc>
           <w:tcPr>
             <w:tcW w:w="3200" w:type="dxa"/>
@@ -1050,12 +1070,6 @@
         </w:tc>
       </w:tr>
       <w:tr>
-        <w:tblPrEx>
-          <w:tblCellMar>
-            <w:top w:w="0" w:type="dxa"/>
-            <w:bottom w:w="0" w:type="dxa"/>
-          </w:tblCellMar>
-        </w:tblPrEx>
         <w:tc>
           <w:tcPr>
             <w:tcW w:w="3200" w:type="dxa"/>
@@ -1117,12 +1131,6 @@
         </w:tc>
       </w:tr>
       <w:tr>
-        <w:tblPrEx>
-          <w:tblCellMar>
-            <w:top w:w="0" w:type="dxa"/>
-            <w:bottom w:w="0" w:type="dxa"/>
-          </w:tblCellMar>
-        </w:tblPrEx>
         <w:tc>
           <w:tcPr>
             <w:tcW w:w="3200" w:type="dxa"/>
@@ -1308,12 +1316,6 @@
         <w:gridCol w:w="2143"/>
       </w:tblGrid>
       <w:tr>
-        <w:tblPrEx>
-          <w:tblCellMar>
-            <w:top w:w="0" w:type="dxa"/>
-            <w:bottom w:w="0" w:type="dxa"/>
-          </w:tblCellMar>
-        </w:tblPrEx>
         <w:tc>
           <w:tcPr>
             <w:tcW w:w="2961" w:type="dxa"/>
@@ -1760,12 +1762,6 @@
         <w:gridCol w:w="1341"/>
       </w:tblGrid>
       <w:tr>
-        <w:tblPrEx>
-          <w:tblCellMar>
-            <w:top w:w="0" w:type="dxa"/>
-            <w:bottom w:w="0" w:type="dxa"/>
-          </w:tblCellMar>
-        </w:tblPrEx>
         <w:trPr>
           <w:tblHeader/>
         </w:trPr>
@@ -1975,12 +1971,6 @@
         </w:tc>
       </w:tr>
       <w:tr>
-        <w:tblPrEx>
-          <w:tblCellMar>
-            <w:top w:w="0" w:type="dxa"/>
-            <w:bottom w:w="0" w:type="dxa"/>
-          </w:tblCellMar>
-        </w:tblPrEx>
         <w:tc>
           <w:tcPr>
             <w:tcW w:w="2500" w:type="dxa"/>
@@ -2166,12 +2156,6 @@
         </w:tc>
       </w:tr>
       <w:tr>
-        <w:tblPrEx>
-          <w:tblCellMar>
-            <w:top w:w="0" w:type="dxa"/>
-            <w:bottom w:w="0" w:type="dxa"/>
-          </w:tblCellMar>
-        </w:tblPrEx>
         <w:tc>
           <w:tcPr>
             <w:tcW w:w="2500" w:type="dxa"/>
@@ -2357,12 +2341,6 @@
         </w:tc>
       </w:tr>
       <w:tr>
-        <w:tblPrEx>
-          <w:tblCellMar>
-            <w:top w:w="0" w:type="dxa"/>
-            <w:bottom w:w="0" w:type="dxa"/>
-          </w:tblCellMar>
-        </w:tblPrEx>
         <w:tc>
           <w:tcPr>
             <w:tcW w:w="2500" w:type="dxa"/>
@@ -2548,12 +2526,6 @@
         </w:tc>
       </w:tr>
       <w:tr>
-        <w:tblPrEx>
-          <w:tblCellMar>
-            <w:top w:w="0" w:type="dxa"/>
-            <w:bottom w:w="0" w:type="dxa"/>
-          </w:tblCellMar>
-        </w:tblPrEx>
         <w:tc>
           <w:tcPr>
             <w:tcW w:w="2500" w:type="dxa"/>
@@ -2739,12 +2711,6 @@
         </w:tc>
       </w:tr>
       <w:tr>
-        <w:tblPrEx>
-          <w:tblCellMar>
-            <w:top w:w="0" w:type="dxa"/>
-            <w:bottom w:w="0" w:type="dxa"/>
-          </w:tblCellMar>
-        </w:tblPrEx>
         <w:tc>
           <w:tcPr>
             <w:tcW w:w="2500" w:type="dxa"/>
@@ -2930,12 +2896,6 @@
         </w:tc>
       </w:tr>
       <w:tr>
-        <w:tblPrEx>
-          <w:tblCellMar>
-            <w:top w:w="0" w:type="dxa"/>
-            <w:bottom w:w="0" w:type="dxa"/>
-          </w:tblCellMar>
-        </w:tblPrEx>
         <w:tc>
           <w:tcPr>
             <w:tcW w:w="2500" w:type="dxa"/>
@@ -3184,13 +3144,53 @@
       </w:r>
       <w:r>
         <w:rPr>
+          <w:b/>
+          <w:bCs/>
+          <w:color w:val="8B5E00"/>
+        </w:rPr>
+        <w:t xml:space="preserve"> ~~</w:t>
+      </w:r>
+      <w:r>
+        <w:rPr>
           <w:i/>
           <w:iCs/>
           <w:color w:val="8B5E00"/>
           <w:sz w:val="18"/>
           <w:szCs w:val="18"/>
         </w:rPr>
-        <w:t xml:space="preserve"> — Narrativa generada por Agente 4. Explicar principales movimientos en Efectivo, Instrumentos de Inversión y Cuentas por Cobrar. Umbral materialidad: 5% del activo total.</w:t>
+        <w:t xml:space="preserve"> — Narrativa generada por Agente 4. Explicar principales movimientos en Efectivo, Instrumentos de Inversión y Cuentas por Cobrar. Umbral materialidad: 5% del activo </w:t>
+      </w:r>
+      <w:proofErr w:type="gramStart"/>
+      <w:r>
+        <w:rPr>
+          <w:i/>
+          <w:iCs/>
+          <w:color w:val="8B5E00"/>
+          <w:sz w:val="18"/>
+          <w:szCs w:val="18"/>
+        </w:rPr>
+        <w:t>total.</w:t>
+      </w:r>
+      <w:r>
+        <w:rPr>
+          <w:i/>
+          <w:iCs/>
+          <w:color w:val="8B5E00"/>
+          <w:sz w:val="18"/>
+          <w:szCs w:val="18"/>
+        </w:rPr>
+        <w:t>~</w:t>
+      </w:r>
+      <w:proofErr w:type="gramEnd"/>
+      <w:r>
+        <w:rPr>
+          <w:i/>
+          <w:iCs/>
+          <w:color w:val="8B5E00"/>
+          <w:sz w:val="18"/>
+          <w:szCs w:val="18"/>
+        </w:rPr>
+        <w:t>~</w:t>
       </w:r>
     </w:p>
     <w:p>
@@ -3251,13 +3251,53 @@
       </w:r>
       <w:r>
         <w:rPr>
+          <w:b/>
+          <w:bCs/>
+          <w:color w:val="8B5E00"/>
+        </w:rPr>
+        <w:t xml:space="preserve"> ~~</w:t>
+      </w:r>
+      <w:r>
+        <w:rPr>
           <w:i/>
           <w:iCs/>
           <w:color w:val="8B5E00"/>
           <w:sz w:val="18"/>
           <w:szCs w:val="18"/>
         </w:rPr>
-        <w:t xml:space="preserve"> — Variaciones en cuentas por pagar, pasivos financieros y activos netos de inversionistas. Flujos de suscripción / retiro del período.</w:t>
+        <w:t xml:space="preserve"> — Variaciones en cuentas por pagar, pasivos financieros y activos netos de inversionistas. Flujos de suscripción / retiro del </w:t>
+      </w:r>
+      <w:proofErr w:type="gramStart"/>
+      <w:r>
+        <w:rPr>
+          <w:i/>
+          <w:iCs/>
+          <w:color w:val="8B5E00"/>
+          <w:sz w:val="18"/>
+          <w:szCs w:val="18"/>
+        </w:rPr>
+        <w:t>período.</w:t>
+      </w:r>
+      <w:r>
+        <w:rPr>
+          <w:i/>
+          <w:iCs/>
+          <w:color w:val="8B5E00"/>
+          <w:sz w:val="18"/>
+          <w:szCs w:val="18"/>
+        </w:rPr>
+        <w:t>~</w:t>
+      </w:r>
+      <w:proofErr w:type="gramEnd"/>
+      <w:r>
+        <w:rPr>
+          <w:i/>
+          <w:iCs/>
+          <w:color w:val="8B5E00"/>
+          <w:sz w:val="18"/>
+          <w:szCs w:val="18"/>
+        </w:rPr>
+        <w:t>~</w:t>
       </w:r>
     </w:p>
     <w:p>
@@ -3388,12 +3428,6 @@
         <w:gridCol w:w="1752"/>
       </w:tblGrid>
       <w:tr>
-        <w:tblPrEx>
-          <w:tblCellMar>
-            <w:top w:w="0" w:type="dxa"/>
-            <w:bottom w:w="0" w:type="dxa"/>
-          </w:tblCellMar>
-        </w:tblPrEx>
         <w:trPr>
           <w:tblHeader/>
         </w:trPr>
@@ -3569,12 +3603,6 @@
         </w:tc>
       </w:tr>
       <w:tr>
-        <w:tblPrEx>
-          <w:tblCellMar>
-            <w:top w:w="0" w:type="dxa"/>
-            <w:bottom w:w="0" w:type="dxa"/>
-          </w:tblCellMar>
-        </w:tblPrEx>
         <w:tc>
           <w:tcPr>
             <w:tcW w:w="3200" w:type="dxa"/>
@@ -3729,12 +3757,6 @@
         </w:tc>
       </w:tr>
       <w:tr>
-        <w:tblPrEx>
-          <w:tblCellMar>
-            <w:top w:w="0" w:type="dxa"/>
-            <w:bottom w:w="0" w:type="dxa"/>
-          </w:tblCellMar>
-        </w:tblPrEx>
         <w:tc>
           <w:tcPr>
             <w:tcW w:w="3200" w:type="dxa"/>
@@ -3889,12 +3911,6 @@
         </w:tc>
       </w:tr>
       <w:tr>
-        <w:tblPrEx>
-          <w:tblCellMar>
-            <w:top w:w="0" w:type="dxa"/>
-            <w:bottom w:w="0" w:type="dxa"/>
-          </w:tblCellMar>
-        </w:tblPrEx>
         <w:tc>
           <w:tcPr>
             <w:tcW w:w="3200" w:type="dxa"/>
@@ -4049,12 +4065,6 @@
         </w:tc>
       </w:tr>
       <w:tr>
-        <w:tblPrEx>
-          <w:tblCellMar>
-            <w:top w:w="0" w:type="dxa"/>
-            <w:bottom w:w="0" w:type="dxa"/>
-          </w:tblCellMar>
-        </w:tblPrEx>
         <w:tc>
           <w:tcPr>
             <w:tcW w:w="3200" w:type="dxa"/>
@@ -4209,12 +4219,6 @@
         </w:tc>
       </w:tr>
       <w:tr>
-        <w:tblPrEx>
-          <w:tblCellMar>
-            <w:top w:w="0" w:type="dxa"/>
-            <w:bottom w:w="0" w:type="dxa"/>
-          </w:tblCellMar>
-        </w:tblPrEx>
         <w:tc>
           <w:tcPr>
             <w:tcW w:w="3200" w:type="dxa"/>
@@ -4369,12 +4373,6 @@
         </w:tc>
       </w:tr>
       <w:tr>
-        <w:tblPrEx>
-          <w:tblCellMar>
-            <w:top w:w="0" w:type="dxa"/>
-            <w:bottom w:w="0" w:type="dxa"/>
-          </w:tblCellMar>
-        </w:tblPrEx>
         <w:tc>
           <w:tcPr>
             <w:tcW w:w="3200" w:type="dxa"/>
@@ -4529,12 +4527,6 @@
         </w:tc>
       </w:tr>
       <w:tr>
-        <w:tblPrEx>
-          <w:tblCellMar>
-            <w:top w:w="0" w:type="dxa"/>
-            <w:bottom w:w="0" w:type="dxa"/>
-          </w:tblCellMar>
-        </w:tblPrEx>
         <w:tc>
           <w:tcPr>
             <w:tcW w:w="3200" w:type="dxa"/>
@@ -4689,12 +4681,6 @@
         </w:tc>
       </w:tr>
       <w:tr>
-        <w:tblPrEx>
-          <w:tblCellMar>
-            <w:top w:w="0" w:type="dxa"/>
-            <w:bottom w:w="0" w:type="dxa"/>
-          </w:tblCellMar>
-        </w:tblPrEx>
         <w:tc>
           <w:tcPr>
             <w:tcW w:w="3200" w:type="dxa"/>
@@ -4919,12 +4905,6 @@
         <w:gridCol w:w="1637"/>
       </w:tblGrid>
       <w:tr>
-        <w:tblPrEx>
-          <w:tblCellMar>
-            <w:top w:w="0" w:type="dxa"/>
-            <w:bottom w:w="0" w:type="dxa"/>
-          </w:tblCellMar>
-        </w:tblPrEx>
         <w:trPr>
           <w:tblHeader/>
         </w:trPr>
@@ -5100,12 +5080,6 @@
         </w:tc>
       </w:tr>
       <w:tr>
-        <w:tblPrEx>
-          <w:tblCellMar>
-            <w:top w:w="0" w:type="dxa"/>
-            <w:bottom w:w="0" w:type="dxa"/>
-          </w:tblCellMar>
-        </w:tblPrEx>
         <w:tc>
           <w:tcPr>
             <w:tcW w:w="3200" w:type="dxa"/>
@@ -5260,12 +5234,6 @@
         </w:tc>
       </w:tr>
       <w:tr>
-        <w:tblPrEx>
-          <w:tblCellMar>
-            <w:top w:w="0" w:type="dxa"/>
-            <w:bottom w:w="0" w:type="dxa"/>
-          </w:tblCellMar>
-        </w:tblPrEx>
         <w:tc>
           <w:tcPr>
             <w:tcW w:w="3200" w:type="dxa"/>
@@ -5420,12 +5388,6 @@
         </w:tc>
       </w:tr>
       <w:tr>
-        <w:tblPrEx>
-          <w:tblCellMar>
-            <w:top w:w="0" w:type="dxa"/>
-            <w:bottom w:w="0" w:type="dxa"/>
-          </w:tblCellMar>
-        </w:tblPrEx>
         <w:tc>
           <w:tcPr>
             <w:tcW w:w="3200" w:type="dxa"/>
@@ -5580,12 +5542,6 @@
         </w:tc>
       </w:tr>
       <w:tr>
-        <w:tblPrEx>
-          <w:tblCellMar>
-            <w:top w:w="0" w:type="dxa"/>
-            <w:bottom w:w="0" w:type="dxa"/>
-          </w:tblCellMar>
-        </w:tblPrEx>
         <w:tc>
           <w:tcPr>
             <w:tcW w:w="3200" w:type="dxa"/>
@@ -5740,12 +5696,6 @@
         </w:tc>
       </w:tr>
       <w:tr>
-        <w:tblPrEx>
-          <w:tblCellMar>
-            <w:top w:w="0" w:type="dxa"/>
-            <w:bottom w:w="0" w:type="dxa"/>
-          </w:tblCellMar>
-        </w:tblPrEx>
         <w:tc>
           <w:tcPr>
             <w:tcW w:w="3200" w:type="dxa"/>
@@ -5900,12 +5850,6 @@
         </w:tc>
       </w:tr>
       <w:tr>
-        <w:tblPrEx>
-          <w:tblCellMar>
-            <w:top w:w="0" w:type="dxa"/>
-            <w:bottom w:w="0" w:type="dxa"/>
-          </w:tblCellMar>
-        </w:tblPrEx>
         <w:tc>
           <w:tcPr>
             <w:tcW w:w="3200" w:type="dxa"/>
@@ -6060,12 +6004,6 @@
         </w:tc>
       </w:tr>
       <w:tr>
-        <w:tblPrEx>
-          <w:tblCellMar>
-            <w:top w:w="0" w:type="dxa"/>
-            <w:bottom w:w="0" w:type="dxa"/>
-          </w:tblCellMar>
-        </w:tblPrEx>
         <w:tc>
           <w:tcPr>
             <w:tcW w:w="3200" w:type="dxa"/>
@@ -6220,12 +6158,6 @@
         </w:tc>
       </w:tr>
       <w:tr>
-        <w:tblPrEx>
-          <w:tblCellMar>
-            <w:top w:w="0" w:type="dxa"/>
-            <w:bottom w:w="0" w:type="dxa"/>
-          </w:tblCellMar>
-        </w:tblPrEx>
         <w:tc>
           <w:tcPr>
             <w:tcW w:w="3200" w:type="dxa"/>
@@ -6443,13 +6375,53 @@
       </w:r>
       <w:r>
         <w:rPr>
+          <w:b/>
+          <w:bCs/>
+          <w:color w:val="8B5E00"/>
+        </w:rPr>
+        <w:t xml:space="preserve"> ~~</w:t>
+      </w:r>
+      <w:r>
+        <w:rPr>
           <w:i/>
           <w:iCs/>
           <w:color w:val="8B5E00"/>
           <w:sz w:val="18"/>
           <w:szCs w:val="18"/>
         </w:rPr>
-        <w:t xml:space="preserve"> — Agente 4: Comparativo de ingresos operacionales vs. período anterior. Drivers de variación, composición de ingresos por valoración vs. dividendos vs. venta. Análisis de gastos operacionales y administrativos.</w:t>
+        <w:t xml:space="preserve"> — Agente 4: Comparativo de ingresos operacionales vs. período anterior. Drivers de variación, composición de ingresos por valoración vs. dividendos vs. venta. Análisis de gastos operacionales y </w:t>
+      </w:r>
+      <w:proofErr w:type="gramStart"/>
+      <w:r>
+        <w:rPr>
+          <w:i/>
+          <w:iCs/>
+          <w:color w:val="8B5E00"/>
+          <w:sz w:val="18"/>
+          <w:szCs w:val="18"/>
+        </w:rPr>
+        <w:t>administrativos.</w:t>
+      </w:r>
+      <w:r>
+        <w:rPr>
+          <w:i/>
+          <w:iCs/>
+          <w:color w:val="8B5E00"/>
+          <w:sz w:val="18"/>
+          <w:szCs w:val="18"/>
+        </w:rPr>
+        <w:t>~</w:t>
+      </w:r>
+      <w:proofErr w:type="gramEnd"/>
+      <w:r>
+        <w:rPr>
+          <w:i/>
+          <w:iCs/>
+          <w:color w:val="8B5E00"/>
+          <w:sz w:val="18"/>
+          <w:szCs w:val="18"/>
+        </w:rPr>
+        <w:t>~</w:t>
       </w:r>
     </w:p>
     <w:p>
@@ -6580,12 +6552,6 @@
         <w:gridCol w:w="4508"/>
       </w:tblGrid>
       <w:tr>
-        <w:tblPrEx>
-          <w:tblCellMar>
-            <w:top w:w="0" w:type="dxa"/>
-            <w:bottom w:w="0" w:type="dxa"/>
-          </w:tblCellMar>
-        </w:tblPrEx>
         <w:tc>
           <w:tcPr>
             <w:tcW w:w="3850" w:type="dxa"/>
@@ -6881,12 +6847,6 @@
         <w:gridCol w:w="1605"/>
       </w:tblGrid>
       <w:tr>
-        <w:tblPrEx>
-          <w:tblCellMar>
-            <w:top w:w="0" w:type="dxa"/>
-            <w:bottom w:w="0" w:type="dxa"/>
-          </w:tblCellMar>
-        </w:tblPrEx>
         <w:trPr>
           <w:tblHeader/>
         </w:trPr>
@@ -7096,12 +7056,6 @@
         </w:tc>
       </w:tr>
       <w:tr>
-        <w:tblPrEx>
-          <w:tblCellMar>
-            <w:top w:w="0" w:type="dxa"/>
-            <w:bottom w:w="0" w:type="dxa"/>
-          </w:tblCellMar>
-        </w:tblPrEx>
         <w:tc>
           <w:tcPr>
             <w:tcW w:w="2600" w:type="dxa"/>
@@ -7395,12 +7349,6 @@
         </w:tc>
       </w:tr>
       <w:tr>
-        <w:tblPrEx>
-          <w:tblCellMar>
-            <w:top w:w="0" w:type="dxa"/>
-            <w:bottom w:w="0" w:type="dxa"/>
-          </w:tblCellMar>
-        </w:tblPrEx>
         <w:tc>
           <w:tcPr>
             <w:tcW w:w="2600" w:type="dxa"/>
@@ -7694,12 +7642,6 @@
         </w:tc>
       </w:tr>
       <w:tr>
-        <w:tblPrEx>
-          <w:tblCellMar>
-            <w:top w:w="0" w:type="dxa"/>
-            <w:bottom w:w="0" w:type="dxa"/>
-          </w:tblCellMar>
-        </w:tblPrEx>
         <w:tc>
           <w:tcPr>
             <w:tcW w:w="2600" w:type="dxa"/>
@@ -7993,12 +7935,6 @@
         </w:tc>
       </w:tr>
       <w:tr>
-        <w:tblPrEx>
-          <w:tblCellMar>
-            <w:top w:w="0" w:type="dxa"/>
-            <w:bottom w:w="0" w:type="dxa"/>
-          </w:tblCellMar>
-        </w:tblPrEx>
         <w:tc>
           <w:tcPr>
             <w:tcW w:w="2600" w:type="dxa"/>
@@ -8292,12 +8228,6 @@
         </w:tc>
       </w:tr>
       <w:tr>
-        <w:tblPrEx>
-          <w:tblCellMar>
-            <w:top w:w="0" w:type="dxa"/>
-            <w:bottom w:w="0" w:type="dxa"/>
-          </w:tblCellMar>
-        </w:tblPrEx>
         <w:tc>
           <w:tcPr>
             <w:tcW w:w="2600" w:type="dxa"/>
@@ -8591,12 +8521,6 @@
         </w:tc>
       </w:tr>
       <w:tr>
-        <w:tblPrEx>
-          <w:tblCellMar>
-            <w:top w:w="0" w:type="dxa"/>
-            <w:bottom w:w="0" w:type="dxa"/>
-          </w:tblCellMar>
-        </w:tblPrEx>
         <w:tc>
           <w:tcPr>
             <w:tcW w:w="2600" w:type="dxa"/>
@@ -8890,12 +8814,6 @@
         </w:tc>
       </w:tr>
       <w:tr>
-        <w:tblPrEx>
-          <w:tblCellMar>
-            <w:top w:w="0" w:type="dxa"/>
-            <w:bottom w:w="0" w:type="dxa"/>
-          </w:tblCellMar>
-        </w:tblPrEx>
         <w:tc>
           <w:tcPr>
             <w:tcW w:w="2600" w:type="dxa"/>
@@ -9189,12 +9107,6 @@
         </w:tc>
       </w:tr>
       <w:tr>
-        <w:tblPrEx>
-          <w:tblCellMar>
-            <w:top w:w="0" w:type="dxa"/>
-            <w:bottom w:w="0" w:type="dxa"/>
-          </w:tblCellMar>
-        </w:tblPrEx>
         <w:tc>
           <w:tcPr>
             <w:tcW w:w="2600" w:type="dxa"/>
@@ -9488,12 +9400,6 @@
         </w:tc>
       </w:tr>
       <w:tr>
-        <w:tblPrEx>
-          <w:tblCellMar>
-            <w:top w:w="0" w:type="dxa"/>
-            <w:bottom w:w="0" w:type="dxa"/>
-          </w:tblCellMar>
-        </w:tblPrEx>
         <w:tc>
           <w:tcPr>
             <w:tcW w:w="2600" w:type="dxa"/>
@@ -9787,12 +9693,6 @@
         </w:tc>
       </w:tr>
       <w:tr>
-        <w:tblPrEx>
-          <w:tblCellMar>
-            <w:top w:w="0" w:type="dxa"/>
-            <w:bottom w:w="0" w:type="dxa"/>
-          </w:tblCellMar>
-        </w:tblPrEx>
         <w:tc>
           <w:tcPr>
             <w:tcW w:w="2600" w:type="dxa"/>
@@ -10111,17 +10011,7 @@
           <w:sz w:val="22"/>
           <w:szCs w:val="22"/>
         </w:rPr>
-        <w:t>4.2 Jerarquía</w:t>
-      </w:r>
-      <w:r>
-        <w:rPr>
-          <w:b/>
-          <w:bCs/>
-          <w:color w:val="2E4A7A"/>
-          <w:sz w:val="22"/>
-          <w:szCs w:val="22"/>
-        </w:rPr>
-        <w:t xml:space="preserve"> de Valor Razonable</w:t>
+        <w:t>4.2 Jerarquía de Valor Razonable</w:t>
       </w:r>
     </w:p>
     <w:p>
@@ -10154,12 +10044,6 @@
         <w:gridCol w:w="1912"/>
       </w:tblGrid>
       <w:tr>
-        <w:tblPrEx>
-          <w:tblCellMar>
-            <w:top w:w="0" w:type="dxa"/>
-            <w:bottom w:w="0" w:type="dxa"/>
-          </w:tblCellMar>
-        </w:tblPrEx>
         <w:trPr>
           <w:tblHeader/>
         </w:trPr>
@@ -10335,12 +10219,6 @@
         </w:tc>
       </w:tr>
       <w:tr>
-        <w:tblPrEx>
-          <w:tblCellMar>
-            <w:top w:w="0" w:type="dxa"/>
-            <w:bottom w:w="0" w:type="dxa"/>
-          </w:tblCellMar>
-        </w:tblPrEx>
         <w:tc>
           <w:tcPr>
             <w:tcW w:w="2400" w:type="dxa"/>
@@ -10495,12 +10373,6 @@
         </w:tc>
       </w:tr>
       <w:tr>
-        <w:tblPrEx>
-          <w:tblCellMar>
-            <w:top w:w="0" w:type="dxa"/>
-            <w:bottom w:w="0" w:type="dxa"/>
-          </w:tblCellMar>
-        </w:tblPrEx>
         <w:tc>
           <w:tcPr>
             <w:tcW w:w="2400" w:type="dxa"/>
@@ -10655,12 +10527,6 @@
         </w:tc>
       </w:tr>
       <w:tr>
-        <w:tblPrEx>
-          <w:tblCellMar>
-            <w:top w:w="0" w:type="dxa"/>
-            <w:bottom w:w="0" w:type="dxa"/>
-          </w:tblCellMar>
-        </w:tblPrEx>
         <w:tc>
           <w:tcPr>
             <w:tcW w:w="2400" w:type="dxa"/>
@@ -10815,12 +10681,6 @@
         </w:tc>
       </w:tr>
       <w:tr>
-        <w:tblPrEx>
-          <w:tblCellMar>
-            <w:top w:w="0" w:type="dxa"/>
-            <w:bottom w:w="0" w:type="dxa"/>
-          </w:tblCellMar>
-        </w:tblPrEx>
         <w:tc>
           <w:tcPr>
             <w:tcW w:w="2400" w:type="dxa"/>
@@ -11000,17 +10860,7 @@
           <w:sz w:val="22"/>
           <w:szCs w:val="22"/>
         </w:rPr>
-        <w:t>4.3 Análisis</w:t>
-      </w:r>
-      <w:r>
-        <w:rPr>
-          <w:b/>
-          <w:bCs/>
-          <w:color w:val="2E4A7A"/>
-          <w:sz w:val="22"/>
-          <w:szCs w:val="22"/>
-        </w:rPr>
-        <w:t xml:space="preserve"> del Portafolio — Agente IA</w:t>
+        <w:t>4.3 Análisis del Portafolio — Agente IA</w:t>
       </w:r>
     </w:p>
     <w:p>
@@ -11054,6 +10904,14 @@
       </w:r>
       <w:r>
         <w:rPr>
+          <w:b/>
+          <w:bCs/>
+          <w:color w:val="8B5E00"/>
+        </w:rPr>
+        <w:t xml:space="preserve"> ~~</w:t>
+      </w:r>
+      <w:r>
+        <w:rPr>
           <w:i/>
           <w:iCs/>
           <w:color w:val="8B5E00"/>
@@ -11061,6 +10919,16 @@
           <w:szCs w:val="18"/>
         </w:rPr>
         <w:t xml:space="preserve"> — Agente 4: Rotación de posiciones respecto a período anterior. Nuevas posiciones significativas (Bonos US, SSGA, Grupo CIBEST). Posiciones liquidadas. Concentración por emisor / clase de activo. Alineación con política de inversión del Fondo.</w:t>
+      </w:r>
+      <w:r>
+        <w:rPr>
+          <w:i/>
+          <w:iCs/>
+          <w:color w:val="8B5E00"/>
+          <w:sz w:val="18"/>
+          <w:szCs w:val="18"/>
+        </w:rPr>
+        <w:t xml:space="preserve"> ~~</w:t>
       </w:r>
     </w:p>
     <w:p>
@@ -11144,17 +11012,7 @@
           <w:sz w:val="22"/>
           <w:szCs w:val="22"/>
         </w:rPr>
-        <w:t>5.1 Composición</w:t>
-      </w:r>
-      <w:r>
-        <w:rPr>
-          <w:b/>
-          <w:bCs/>
-          <w:color w:val="2E4A7A"/>
-          <w:sz w:val="22"/>
-          <w:szCs w:val="22"/>
-        </w:rPr>
-        <w:t xml:space="preserve"> por Clase</w:t>
+        <w:t>5.1 Composición por Clase</w:t>
       </w:r>
     </w:p>
     <w:p>
@@ -11188,12 +11046,6 @@
         <w:gridCol w:w="1605"/>
       </w:tblGrid>
       <w:tr>
-        <w:tblPrEx>
-          <w:tblCellMar>
-            <w:top w:w="0" w:type="dxa"/>
-            <w:bottom w:w="0" w:type="dxa"/>
-          </w:tblCellMar>
-        </w:tblPrEx>
         <w:trPr>
           <w:tblHeader/>
         </w:trPr>
@@ -11425,12 +11277,6 @@
         </w:tc>
       </w:tr>
       <w:tr>
-        <w:tblPrEx>
-          <w:tblCellMar>
-            <w:top w:w="0" w:type="dxa"/>
-            <w:bottom w:w="0" w:type="dxa"/>
-          </w:tblCellMar>
-        </w:tblPrEx>
         <w:tc>
           <w:tcPr>
             <w:tcW w:w="1700" w:type="dxa"/>
@@ -11616,12 +11462,6 @@
         </w:tc>
       </w:tr>
       <w:tr>
-        <w:tblPrEx>
-          <w:tblCellMar>
-            <w:top w:w="0" w:type="dxa"/>
-            <w:bottom w:w="0" w:type="dxa"/>
-          </w:tblCellMar>
-        </w:tblPrEx>
         <w:tc>
           <w:tcPr>
             <w:tcW w:w="1700" w:type="dxa"/>
@@ -11807,12 +11647,6 @@
         </w:tc>
       </w:tr>
       <w:tr>
-        <w:tblPrEx>
-          <w:tblCellMar>
-            <w:top w:w="0" w:type="dxa"/>
-            <w:bottom w:w="0" w:type="dxa"/>
-          </w:tblCellMar>
-        </w:tblPrEx>
         <w:tc>
           <w:tcPr>
             <w:tcW w:w="1700" w:type="dxa"/>
@@ -11998,12 +11832,6 @@
         </w:tc>
       </w:tr>
       <w:tr>
-        <w:tblPrEx>
-          <w:tblCellMar>
-            <w:top w:w="0" w:type="dxa"/>
-            <w:bottom w:w="0" w:type="dxa"/>
-          </w:tblCellMar>
-        </w:tblPrEx>
         <w:tc>
           <w:tcPr>
             <w:tcW w:w="1700" w:type="dxa"/>
@@ -12189,12 +12017,6 @@
         </w:tc>
       </w:tr>
       <w:tr>
-        <w:tblPrEx>
-          <w:tblCellMar>
-            <w:top w:w="0" w:type="dxa"/>
-            <w:bottom w:w="0" w:type="dxa"/>
-          </w:tblCellMar>
-        </w:tblPrEx>
         <w:tc>
           <w:tcPr>
             <w:tcW w:w="1700" w:type="dxa"/>
@@ -12405,17 +12227,7 @@
           <w:sz w:val="22"/>
           <w:szCs w:val="22"/>
         </w:rPr>
-        <w:t>5.2 Movimientos</w:t>
-      </w:r>
-      <w:r>
-        <w:rPr>
-          <w:b/>
-          <w:bCs/>
-          <w:color w:val="2E4A7A"/>
-          <w:sz w:val="22"/>
-          <w:szCs w:val="22"/>
-        </w:rPr>
-        <w:t xml:space="preserve"> del Período</w:t>
+        <w:t>5.2 Movimientos del Período</w:t>
       </w:r>
     </w:p>
     <w:p>
@@ -12447,12 +12259,6 @@
         <w:gridCol w:w="2394"/>
       </w:tblGrid>
       <w:tr>
-        <w:tblPrEx>
-          <w:tblCellMar>
-            <w:top w:w="0" w:type="dxa"/>
-            <w:bottom w:w="0" w:type="dxa"/>
-          </w:tblCellMar>
-        </w:tblPrEx>
         <w:trPr>
           <w:tblHeader/>
         </w:trPr>
@@ -12594,12 +12400,6 @@
         </w:tc>
       </w:tr>
       <w:tr>
-        <w:tblPrEx>
-          <w:tblCellMar>
-            <w:top w:w="0" w:type="dxa"/>
-            <w:bottom w:w="0" w:type="dxa"/>
-          </w:tblCellMar>
-        </w:tblPrEx>
         <w:tc>
           <w:tcPr>
             <w:tcW w:w="3200" w:type="dxa"/>
@@ -12723,12 +12523,6 @@
         </w:tc>
       </w:tr>
       <w:tr>
-        <w:tblPrEx>
-          <w:tblCellMar>
-            <w:top w:w="0" w:type="dxa"/>
-            <w:bottom w:w="0" w:type="dxa"/>
-          </w:tblCellMar>
-        </w:tblPrEx>
         <w:tc>
           <w:tcPr>
             <w:tcW w:w="3200" w:type="dxa"/>
@@ -12852,12 +12646,6 @@
         </w:tc>
       </w:tr>
       <w:tr>
-        <w:tblPrEx>
-          <w:tblCellMar>
-            <w:top w:w="0" w:type="dxa"/>
-            <w:bottom w:w="0" w:type="dxa"/>
-          </w:tblCellMar>
-        </w:tblPrEx>
         <w:tc>
           <w:tcPr>
             <w:tcW w:w="3200" w:type="dxa"/>
@@ -12981,12 +12769,6 @@
         </w:tc>
       </w:tr>
       <w:tr>
-        <w:tblPrEx>
-          <w:tblCellMar>
-            <w:top w:w="0" w:type="dxa"/>
-            <w:bottom w:w="0" w:type="dxa"/>
-          </w:tblCellMar>
-        </w:tblPrEx>
         <w:tc>
           <w:tcPr>
             <w:tcW w:w="3200" w:type="dxa"/>
@@ -13135,17 +12917,7 @@
           <w:sz w:val="22"/>
           <w:szCs w:val="22"/>
         </w:rPr>
-        <w:t>5.3 Análisis</w:t>
-      </w:r>
-      <w:r>
-        <w:rPr>
-          <w:b/>
-          <w:bCs/>
-          <w:color w:val="2E4A7A"/>
-          <w:sz w:val="22"/>
-          <w:szCs w:val="22"/>
-        </w:rPr>
-        <w:t xml:space="preserve"> de Flujos y Desempeño</w:t>
+        <w:t>5.3 Análisis de Flujos y Desempeño</w:t>
       </w:r>
     </w:p>
     <w:p>
@@ -13171,6 +12943,14 @@
       </w:r>
       <w:r>
         <w:rPr>
+          <w:b/>
+          <w:bCs/>
+          <w:color w:val="8B5E00"/>
+        </w:rPr>
+        <w:t xml:space="preserve"> ~~</w:t>
+      </w:r>
+      <w:r>
+        <w:rPr>
           <w:i/>
           <w:iCs/>
           <w:color w:val="8B5E00"/>
@@ -13178,6 +12958,16 @@
           <w:szCs w:val="18"/>
         </w:rPr>
         <w:t xml:space="preserve"> — Agente 4 + Agente 5: Decrecimiento del valor del fondo (-8.94% YTD). Flujos netos de inversionistas. Clases con mayor entrada / salida. Impacto en valor unitario por clase. Rentabilidad atribuible a gestión vs. mercado.</w:t>
+      </w:r>
+      <w:r>
+        <w:rPr>
+          <w:i/>
+          <w:iCs/>
+          <w:color w:val="8B5E00"/>
+          <w:sz w:val="18"/>
+          <w:szCs w:val="18"/>
+        </w:rPr>
+        <w:t xml:space="preserve"> ~~</w:t>
       </w:r>
     </w:p>
     <w:p>
@@ -13261,17 +13051,7 @@
           <w:sz w:val="22"/>
           <w:szCs w:val="22"/>
         </w:rPr>
-        <w:t>6.1 Hallazgos</w:t>
-      </w:r>
-      <w:r>
-        <w:rPr>
-          <w:b/>
-          <w:bCs/>
-          <w:color w:val="2E4A7A"/>
-          <w:sz w:val="22"/>
-          <w:szCs w:val="22"/>
-        </w:rPr>
-        <w:t xml:space="preserve"> de Alta Prioridad</w:t>
+        <w:t>6.1 Hallazgos de Alta Prioridad</w:t>
       </w:r>
     </w:p>
     <w:p>
@@ -13301,12 +13081,6 @@
         <w:gridCol w:w="8829"/>
       </w:tblGrid>
       <w:tr>
-        <w:tblPrEx>
-          <w:tblCellMar>
-            <w:top w:w="0" w:type="dxa"/>
-            <w:bottom w:w="0" w:type="dxa"/>
-          </w:tblCellMar>
-        </w:tblPrEx>
         <w:tc>
           <w:tcPr>
             <w:tcW w:w="300" w:type="dxa"/>
@@ -13374,11 +13148,17 @@
             </w:tcMar>
           </w:tcPr>
           <w:p>
+            <w:pPr>
+              <w:rPr>
+                <w:lang w:val="en-US"/>
+              </w:rPr>
+            </w:pPr>
             <w:r>
               <w:rPr>
                 <w:b/>
                 <w:bCs/>
                 <w:color w:val="C0392B"/>
+                <w:lang w:val="en-US"/>
               </w:rPr>
               <w:t>{{FINDING_1_TITLE}}</w:t>
             </w:r>
@@ -13386,6 +13166,9 @@
           <w:p>
             <w:pPr>
               <w:spacing w:before="40"/>
+              <w:rPr>
+                <w:lang w:val="en-US"/>
+              </w:rPr>
             </w:pPr>
             <w:r>
               <w:rPr>
@@ -13394,6 +13177,7 @@
                 <w:color w:val="8B5E00"/>
                 <w:sz w:val="18"/>
                 <w:szCs w:val="18"/>
+                <w:lang w:val="en-US"/>
               </w:rPr>
               <w:t>{{FINDING_1_BODY}}</w:t>
             </w:r>
@@ -13401,7 +13185,11 @@
           <w:p>
             <w:pPr>
               <w:spacing w:before="40"/>
-            </w:pPr>
+              <w:rPr>
+                <w:lang w:val="en-US"/>
+              </w:rPr>
+            </w:pPr>
+            <w:proofErr w:type="spellStart"/>
             <w:r>
               <w:rPr>
                 <w:b/>
@@ -13409,25 +13197,11 @@
                 <w:color w:val="3D3D5C"/>
                 <w:sz w:val="16"/>
                 <w:szCs w:val="16"/>
-              </w:rPr>
-              <w:t xml:space="preserve">Cuenta(s) afectada(s): </w:t>
-            </w:r>
-            <w:r>
-              <w:rPr>
-                <w:color w:val="8B5E00"/>
-                <w:sz w:val="16"/>
-                <w:szCs w:val="16"/>
-              </w:rPr>
-              <w:t>{{FINDING_1_ACCOUNTS</w:t>
-            </w:r>
-            <w:r>
-              <w:rPr>
-                <w:color w:val="8B5E00"/>
-                <w:sz w:val="16"/>
-                <w:szCs w:val="16"/>
-              </w:rPr>
-              <w:t>}}</w:t>
-            </w:r>
+                <w:lang w:val="en-US"/>
+              </w:rPr>
+              <w:t>Cuenta</w:t>
+            </w:r>
+            <w:proofErr w:type="spellEnd"/>
             <w:r>
               <w:rPr>
                 <w:b/>
@@ -13435,9 +13209,11 @@
                 <w:color w:val="3D3D5C"/>
                 <w:sz w:val="16"/>
                 <w:szCs w:val="16"/>
-              </w:rPr>
-              <w:t xml:space="preserve"> |</w:t>
-            </w:r>
+                <w:lang w:val="en-US"/>
+              </w:rPr>
+              <w:t xml:space="preserve">(s) </w:t>
+            </w:r>
+            <w:proofErr w:type="spellStart"/>
             <w:r>
               <w:rPr>
                 <w:b/>
@@ -13445,14 +13221,90 @@
                 <w:color w:val="3D3D5C"/>
                 <w:sz w:val="16"/>
                 <w:szCs w:val="16"/>
-              </w:rPr>
-              <w:t xml:space="preserve">   Impacto: </w:t>
-            </w:r>
-            <w:r>
-              <w:rPr>
-                <w:color w:val="8B5E00"/>
+                <w:lang w:val="en-US"/>
+              </w:rPr>
+              <w:t>afectada</w:t>
+            </w:r>
+            <w:proofErr w:type="spellEnd"/>
+            <w:r>
+              <w:rPr>
+                <w:b/>
+                <w:bCs/>
+                <w:color w:val="3D3D5C"/>
                 <w:sz w:val="16"/>
                 <w:szCs w:val="16"/>
+                <w:lang w:val="en-US"/>
+              </w:rPr>
+              <w:t>(s</w:t>
+            </w:r>
+            <w:proofErr w:type="gramStart"/>
+            <w:r>
+              <w:rPr>
+                <w:b/>
+                <w:bCs/>
+                <w:color w:val="3D3D5C"/>
+                <w:sz w:val="16"/>
+                <w:szCs w:val="16"/>
+                <w:lang w:val="en-US"/>
+              </w:rPr>
+              <w:t xml:space="preserve">): </w:t>
+            </w:r>
+            <w:r>
+              <w:rPr>
+                <w:color w:val="8B5E00"/>
+                <w:sz w:val="16"/>
+                <w:szCs w:val="16"/>
+                <w:lang w:val="en-US"/>
+              </w:rPr>
+              <w:t>{{</w:t>
+            </w:r>
+            <w:proofErr w:type="gramEnd"/>
+            <w:r>
+              <w:rPr>
+                <w:color w:val="8B5E00"/>
+                <w:sz w:val="16"/>
+                <w:szCs w:val="16"/>
+                <w:lang w:val="en-US"/>
+              </w:rPr>
+              <w:t>FINDING_1_ACCOUNTS</w:t>
+            </w:r>
+            <w:r>
+              <w:rPr>
+                <w:color w:val="8B5E00"/>
+                <w:sz w:val="16"/>
+                <w:szCs w:val="16"/>
+                <w:lang w:val="en-US"/>
+              </w:rPr>
+              <w:t>}}</w:t>
+            </w:r>
+            <w:r>
+              <w:rPr>
+                <w:b/>
+                <w:bCs/>
+                <w:color w:val="3D3D5C"/>
+                <w:sz w:val="16"/>
+                <w:szCs w:val="16"/>
+                <w:lang w:val="en-US"/>
+              </w:rPr>
+              <w:t xml:space="preserve"> |</w:t>
+            </w:r>
+            <w:r>
+              <w:rPr>
+                <w:b/>
+                <w:bCs/>
+                <w:color w:val="3D3D5C"/>
+                <w:sz w:val="16"/>
+                <w:szCs w:val="16"/>
+                <w:lang w:val="en-US"/>
+              </w:rPr>
+              <w:t xml:space="preserve">   Impacto: </w:t>
+            </w:r>
+            <w:r>
+              <w:rPr>
+                <w:color w:val="8B5E00"/>
+                <w:sz w:val="16"/>
+                <w:szCs w:val="16"/>
+                <w:lang w:val="en-US"/>
               </w:rPr>
               <w:t>{{FINDING_1_IMPACT}}</w:t>
             </w:r>
@@ -13463,6 +13315,9 @@
     <w:p>
       <w:pPr>
         <w:spacing w:before="60" w:after="60"/>
+        <w:rPr>
+          <w:lang w:val="en-US"/>
+        </w:rPr>
       </w:pPr>
     </w:p>
     <w:tbl>
@@ -13487,12 +13342,6 @@
         <w:gridCol w:w="8829"/>
       </w:tblGrid>
       <w:tr>
-        <w:tblPrEx>
-          <w:tblCellMar>
-            <w:top w:w="0" w:type="dxa"/>
-            <w:bottom w:w="0" w:type="dxa"/>
-          </w:tblCellMar>
-        </w:tblPrEx>
         <w:tc>
           <w:tcPr>
             <w:tcW w:w="300" w:type="dxa"/>
@@ -13560,11 +13409,17 @@
             </w:tcMar>
           </w:tcPr>
           <w:p>
+            <w:pPr>
+              <w:rPr>
+                <w:lang w:val="en-US"/>
+              </w:rPr>
+            </w:pPr>
             <w:r>
               <w:rPr>
                 <w:b/>
                 <w:bCs/>
                 <w:color w:val="C0392B"/>
+                <w:lang w:val="en-US"/>
               </w:rPr>
               <w:t>{{FINDING_2_TITLE}}</w:t>
             </w:r>
@@ -13572,6 +13427,9 @@
           <w:p>
             <w:pPr>
               <w:spacing w:before="40"/>
+              <w:rPr>
+                <w:lang w:val="en-US"/>
+              </w:rPr>
             </w:pPr>
             <w:r>
               <w:rPr>
@@ -13580,6 +13438,7 @@
                 <w:color w:val="8B5E00"/>
                 <w:sz w:val="18"/>
                 <w:szCs w:val="18"/>
+                <w:lang w:val="en-US"/>
               </w:rPr>
               <w:t>{{FINDING_2_BODY}}</w:t>
             </w:r>
@@ -13587,7 +13446,11 @@
           <w:p>
             <w:pPr>
               <w:spacing w:before="40"/>
-            </w:pPr>
+              <w:rPr>
+                <w:lang w:val="en-US"/>
+              </w:rPr>
+            </w:pPr>
+            <w:proofErr w:type="spellStart"/>
             <w:r>
               <w:rPr>
                 <w:b/>
@@ -13595,25 +13458,11 @@
                 <w:color w:val="3D3D5C"/>
                 <w:sz w:val="16"/>
                 <w:szCs w:val="16"/>
-              </w:rPr>
-              <w:t xml:space="preserve">Cuenta(s) afectada(s): </w:t>
-            </w:r>
-            <w:r>
-              <w:rPr>
-                <w:color w:val="8B5E00"/>
-                <w:sz w:val="16"/>
-                <w:szCs w:val="16"/>
-              </w:rPr>
-              <w:t>{{FINDING_2_ACCOUNTS</w:t>
-            </w:r>
-            <w:r>
-              <w:rPr>
-                <w:color w:val="8B5E00"/>
-                <w:sz w:val="16"/>
-                <w:szCs w:val="16"/>
-              </w:rPr>
-              <w:t>}}</w:t>
-            </w:r>
+                <w:lang w:val="en-US"/>
+              </w:rPr>
+              <w:t>Cuenta</w:t>
+            </w:r>
+            <w:proofErr w:type="spellEnd"/>
             <w:r>
               <w:rPr>
                 <w:b/>
@@ -13621,9 +13470,11 @@
                 <w:color w:val="3D3D5C"/>
                 <w:sz w:val="16"/>
                 <w:szCs w:val="16"/>
-              </w:rPr>
-              <w:t xml:space="preserve"> |</w:t>
-            </w:r>
+                <w:lang w:val="en-US"/>
+              </w:rPr>
+              <w:t xml:space="preserve">(s) </w:t>
+            </w:r>
+            <w:proofErr w:type="spellStart"/>
             <w:r>
               <w:rPr>
                 <w:b/>
@@ -13631,14 +13482,90 @@
                 <w:color w:val="3D3D5C"/>
                 <w:sz w:val="16"/>
                 <w:szCs w:val="16"/>
-              </w:rPr>
-              <w:t xml:space="preserve">   Impacto: </w:t>
-            </w:r>
-            <w:r>
-              <w:rPr>
-                <w:color w:val="8B5E00"/>
+                <w:lang w:val="en-US"/>
+              </w:rPr>
+              <w:t>afectada</w:t>
+            </w:r>
+            <w:proofErr w:type="spellEnd"/>
+            <w:r>
+              <w:rPr>
+                <w:b/>
+                <w:bCs/>
+                <w:color w:val="3D3D5C"/>
                 <w:sz w:val="16"/>
                 <w:szCs w:val="16"/>
+                <w:lang w:val="en-US"/>
+              </w:rPr>
+              <w:t>(s</w:t>
+            </w:r>
+            <w:proofErr w:type="gramStart"/>
+            <w:r>
+              <w:rPr>
+                <w:b/>
+                <w:bCs/>
+                <w:color w:val="3D3D5C"/>
+                <w:sz w:val="16"/>
+                <w:szCs w:val="16"/>
+                <w:lang w:val="en-US"/>
+              </w:rPr>
+              <w:t xml:space="preserve">): </w:t>
+            </w:r>
+            <w:r>
+              <w:rPr>
+                <w:color w:val="8B5E00"/>
+                <w:sz w:val="16"/>
+                <w:szCs w:val="16"/>
+                <w:lang w:val="en-US"/>
+              </w:rPr>
+              <w:t>{{</w:t>
+            </w:r>
+            <w:proofErr w:type="gramEnd"/>
+            <w:r>
+              <w:rPr>
+                <w:color w:val="8B5E00"/>
+                <w:sz w:val="16"/>
+                <w:szCs w:val="16"/>
+                <w:lang w:val="en-US"/>
+              </w:rPr>
+              <w:t>FINDING_2_ACCOUNTS</w:t>
+            </w:r>
+            <w:r>
+              <w:rPr>
+                <w:color w:val="8B5E00"/>
+                <w:sz w:val="16"/>
+                <w:szCs w:val="16"/>
+                <w:lang w:val="en-US"/>
+              </w:rPr>
+              <w:t>}}</w:t>
+            </w:r>
+            <w:r>
+              <w:rPr>
+                <w:b/>
+                <w:bCs/>
+                <w:color w:val="3D3D5C"/>
+                <w:sz w:val="16"/>
+                <w:szCs w:val="16"/>
+                <w:lang w:val="en-US"/>
+              </w:rPr>
+              <w:t xml:space="preserve"> |</w:t>
+            </w:r>
+            <w:r>
+              <w:rPr>
+                <w:b/>
+                <w:bCs/>
+                <w:color w:val="3D3D5C"/>
+                <w:sz w:val="16"/>
+                <w:szCs w:val="16"/>
+                <w:lang w:val="en-US"/>
+              </w:rPr>
+              <w:t xml:space="preserve">   Impacto: </w:t>
+            </w:r>
+            <w:r>
+              <w:rPr>
+                <w:color w:val="8B5E00"/>
+                <w:sz w:val="16"/>
+                <w:szCs w:val="16"/>
+                <w:lang w:val="en-US"/>
               </w:rPr>
               <w:t>{{FINDING_2_IMPACT}}</w:t>
             </w:r>
@@ -13649,11 +13576,17 @@
     <w:p>
       <w:pPr>
         <w:spacing w:before="60" w:after="60"/>
+        <w:rPr>
+          <w:lang w:val="en-US"/>
+        </w:rPr>
       </w:pPr>
     </w:p>
     <w:p>
       <w:pPr>
         <w:spacing w:before="120" w:after="40"/>
+        <w:rPr>
+          <w:lang w:val="en-US"/>
+        </w:rPr>
       </w:pPr>
     </w:p>
     <w:p>
@@ -13671,17 +13604,7 @@
           <w:sz w:val="22"/>
           <w:szCs w:val="22"/>
         </w:rPr>
-        <w:t>6.2 Hallazgos</w:t>
-      </w:r>
-      <w:r>
-        <w:rPr>
-          <w:b/>
-          <w:bCs/>
-          <w:color w:val="2E4A7A"/>
-          <w:sz w:val="22"/>
-          <w:szCs w:val="22"/>
-        </w:rPr>
-        <w:t xml:space="preserve"> de Riesgo Moderado</w:t>
+        <w:t>6.2 Hallazgos de Riesgo Moderado</w:t>
       </w:r>
     </w:p>
     <w:p>
@@ -13711,12 +13634,6 @@
         <w:gridCol w:w="8855"/>
       </w:tblGrid>
       <w:tr>
-        <w:tblPrEx>
-          <w:tblCellMar>
-            <w:top w:w="0" w:type="dxa"/>
-            <w:bottom w:w="0" w:type="dxa"/>
-          </w:tblCellMar>
-        </w:tblPrEx>
         <w:tc>
           <w:tcPr>
             <w:tcW w:w="300" w:type="dxa"/>
@@ -13784,11 +13701,17 @@
             </w:tcMar>
           </w:tcPr>
           <w:p>
+            <w:pPr>
+              <w:rPr>
+                <w:lang w:val="en-US"/>
+              </w:rPr>
+            </w:pPr>
             <w:r>
               <w:rPr>
                 <w:b/>
                 <w:bCs/>
                 <w:color w:val="D4A017"/>
+                <w:lang w:val="en-US"/>
               </w:rPr>
               <w:t>{{FINDING_3_TITLE}}</w:t>
             </w:r>
@@ -13796,6 +13719,9 @@
           <w:p>
             <w:pPr>
               <w:spacing w:before="40"/>
+              <w:rPr>
+                <w:lang w:val="en-US"/>
+              </w:rPr>
             </w:pPr>
             <w:r>
               <w:rPr>
@@ -13804,6 +13730,7 @@
                 <w:color w:val="8B5E00"/>
                 <w:sz w:val="18"/>
                 <w:szCs w:val="18"/>
+                <w:lang w:val="en-US"/>
               </w:rPr>
               <w:t>{{FINDING_3_BODY}}</w:t>
             </w:r>
@@ -13811,7 +13738,11 @@
           <w:p>
             <w:pPr>
               <w:spacing w:before="40"/>
-            </w:pPr>
+              <w:rPr>
+                <w:lang w:val="en-US"/>
+              </w:rPr>
+            </w:pPr>
+            <w:proofErr w:type="spellStart"/>
             <w:r>
               <w:rPr>
                 <w:b/>
@@ -13819,25 +13750,11 @@
                 <w:color w:val="3D3D5C"/>
                 <w:sz w:val="16"/>
                 <w:szCs w:val="16"/>
-              </w:rPr>
-              <w:t xml:space="preserve">Cuenta(s) afectada(s): </w:t>
-            </w:r>
-            <w:r>
-              <w:rPr>
-                <w:color w:val="8B5E00"/>
-                <w:sz w:val="16"/>
-                <w:szCs w:val="16"/>
-              </w:rPr>
-              <w:t>{{FINDING_3_ACCOUNTS</w:t>
-            </w:r>
-            <w:r>
-              <w:rPr>
-                <w:color w:val="8B5E00"/>
-                <w:sz w:val="16"/>
-                <w:szCs w:val="16"/>
-              </w:rPr>
-              <w:t>}}</w:t>
-            </w:r>
+                <w:lang w:val="en-US"/>
+              </w:rPr>
+              <w:t>Cuenta</w:t>
+            </w:r>
+            <w:proofErr w:type="spellEnd"/>
             <w:r>
               <w:rPr>
                 <w:b/>
@@ -13845,9 +13762,11 @@
                 <w:color w:val="3D3D5C"/>
                 <w:sz w:val="16"/>
                 <w:szCs w:val="16"/>
-              </w:rPr>
-              <w:t xml:space="preserve"> |</w:t>
-            </w:r>
+                <w:lang w:val="en-US"/>
+              </w:rPr>
+              <w:t xml:space="preserve">(s) </w:t>
+            </w:r>
+            <w:proofErr w:type="spellStart"/>
             <w:r>
               <w:rPr>
                 <w:b/>
@@ -13855,14 +13774,90 @@
                 <w:color w:val="3D3D5C"/>
                 <w:sz w:val="16"/>
                 <w:szCs w:val="16"/>
-              </w:rPr>
-              <w:t xml:space="preserve">   Impacto: </w:t>
-            </w:r>
-            <w:r>
-              <w:rPr>
-                <w:color w:val="8B5E00"/>
+                <w:lang w:val="en-US"/>
+              </w:rPr>
+              <w:t>afectada</w:t>
+            </w:r>
+            <w:proofErr w:type="spellEnd"/>
+            <w:r>
+              <w:rPr>
+                <w:b/>
+                <w:bCs/>
+                <w:color w:val="3D3D5C"/>
                 <w:sz w:val="16"/>
                 <w:szCs w:val="16"/>
+                <w:lang w:val="en-US"/>
+              </w:rPr>
+              <w:t>(s</w:t>
+            </w:r>
+            <w:proofErr w:type="gramStart"/>
+            <w:r>
+              <w:rPr>
+                <w:b/>
+                <w:bCs/>
+                <w:color w:val="3D3D5C"/>
+                <w:sz w:val="16"/>
+                <w:szCs w:val="16"/>
+                <w:lang w:val="en-US"/>
+              </w:rPr>
+              <w:t xml:space="preserve">): </w:t>
+            </w:r>
+            <w:r>
+              <w:rPr>
+                <w:color w:val="8B5E00"/>
+                <w:sz w:val="16"/>
+                <w:szCs w:val="16"/>
+                <w:lang w:val="en-US"/>
+              </w:rPr>
+              <w:t>{{</w:t>
+            </w:r>
+            <w:proofErr w:type="gramEnd"/>
+            <w:r>
+              <w:rPr>
+                <w:color w:val="8B5E00"/>
+                <w:sz w:val="16"/>
+                <w:szCs w:val="16"/>
+                <w:lang w:val="en-US"/>
+              </w:rPr>
+              <w:t>FINDING_3_ACCOUNTS</w:t>
+            </w:r>
+            <w:r>
+              <w:rPr>
+                <w:color w:val="8B5E00"/>
+                <w:sz w:val="16"/>
+                <w:szCs w:val="16"/>
+                <w:lang w:val="en-US"/>
+              </w:rPr>
+              <w:t>}}</w:t>
+            </w:r>
+            <w:r>
+              <w:rPr>
+                <w:b/>
+                <w:bCs/>
+                <w:color w:val="3D3D5C"/>
+                <w:sz w:val="16"/>
+                <w:szCs w:val="16"/>
+                <w:lang w:val="en-US"/>
+              </w:rPr>
+              <w:t xml:space="preserve"> |</w:t>
+            </w:r>
+            <w:r>
+              <w:rPr>
+                <w:b/>
+                <w:bCs/>
+                <w:color w:val="3D3D5C"/>
+                <w:sz w:val="16"/>
+                <w:szCs w:val="16"/>
+                <w:lang w:val="en-US"/>
+              </w:rPr>
+              <w:t xml:space="preserve">   Impacto: </w:t>
+            </w:r>
+            <w:r>
+              <w:rPr>
+                <w:color w:val="8B5E00"/>
+                <w:sz w:val="16"/>
+                <w:szCs w:val="16"/>
+                <w:lang w:val="en-US"/>
               </w:rPr>
               <w:t>{{FINDING_3_IMPACT}}</w:t>
             </w:r>
@@ -13873,6 +13868,9 @@
     <w:p>
       <w:pPr>
         <w:spacing w:before="60" w:after="60"/>
+        <w:rPr>
+          <w:lang w:val="en-US"/>
+        </w:rPr>
       </w:pPr>
     </w:p>
     <w:tbl>
@@ -13897,12 +13895,6 @@
         <w:gridCol w:w="8855"/>
       </w:tblGrid>
       <w:tr>
-        <w:tblPrEx>
-          <w:tblCellMar>
-            <w:top w:w="0" w:type="dxa"/>
-            <w:bottom w:w="0" w:type="dxa"/>
-          </w:tblCellMar>
-        </w:tblPrEx>
         <w:tc>
           <w:tcPr>
             <w:tcW w:w="300" w:type="dxa"/>
@@ -13970,11 +13962,17 @@
             </w:tcMar>
           </w:tcPr>
           <w:p>
+            <w:pPr>
+              <w:rPr>
+                <w:lang w:val="en-US"/>
+              </w:rPr>
+            </w:pPr>
             <w:r>
               <w:rPr>
                 <w:b/>
                 <w:bCs/>
                 <w:color w:val="D4A017"/>
+                <w:lang w:val="en-US"/>
               </w:rPr>
               <w:t>{{FINDING_4_TITLE}}</w:t>
             </w:r>
@@ -13982,6 +13980,9 @@
           <w:p>
             <w:pPr>
               <w:spacing w:before="40"/>
+              <w:rPr>
+                <w:lang w:val="en-US"/>
+              </w:rPr>
             </w:pPr>
             <w:r>
               <w:rPr>
@@ -13990,6 +13991,7 @@
                 <w:color w:val="8B5E00"/>
                 <w:sz w:val="18"/>
                 <w:szCs w:val="18"/>
+                <w:lang w:val="en-US"/>
               </w:rPr>
               <w:t>{{FINDING_4_BODY}}</w:t>
             </w:r>
@@ -13997,7 +13999,11 @@
           <w:p>
             <w:pPr>
               <w:spacing w:before="40"/>
-            </w:pPr>
+              <w:rPr>
+                <w:lang w:val="en-US"/>
+              </w:rPr>
+            </w:pPr>
+            <w:proofErr w:type="spellStart"/>
             <w:r>
               <w:rPr>
                 <w:b/>
@@ -14005,25 +14011,11 @@
                 <w:color w:val="3D3D5C"/>
                 <w:sz w:val="16"/>
                 <w:szCs w:val="16"/>
-              </w:rPr>
-              <w:t xml:space="preserve">Cuenta(s) afectada(s): </w:t>
-            </w:r>
-            <w:r>
-              <w:rPr>
-                <w:color w:val="8B5E00"/>
-                <w:sz w:val="16"/>
-                <w:szCs w:val="16"/>
-              </w:rPr>
-              <w:t>{{FINDING_4_ACCOUNTS</w:t>
-            </w:r>
-            <w:r>
-              <w:rPr>
-                <w:color w:val="8B5E00"/>
-                <w:sz w:val="16"/>
-                <w:szCs w:val="16"/>
-              </w:rPr>
-              <w:t>}}</w:t>
-            </w:r>
+                <w:lang w:val="en-US"/>
+              </w:rPr>
+              <w:t>Cuenta</w:t>
+            </w:r>
+            <w:proofErr w:type="spellEnd"/>
             <w:r>
               <w:rPr>
                 <w:b/>
@@ -14031,9 +14023,11 @@
                 <w:color w:val="3D3D5C"/>
                 <w:sz w:val="16"/>
                 <w:szCs w:val="16"/>
-              </w:rPr>
-              <w:t xml:space="preserve"> |</w:t>
-            </w:r>
+                <w:lang w:val="en-US"/>
+              </w:rPr>
+              <w:t xml:space="preserve">(s) </w:t>
+            </w:r>
+            <w:proofErr w:type="spellStart"/>
             <w:r>
               <w:rPr>
                 <w:b/>
@@ -14041,14 +14035,68 @@
                 <w:color w:val="3D3D5C"/>
                 <w:sz w:val="16"/>
                 <w:szCs w:val="16"/>
-              </w:rPr>
-              <w:t xml:space="preserve">   Impacto: </w:t>
-            </w:r>
-            <w:r>
-              <w:rPr>
-                <w:color w:val="8B5E00"/>
+                <w:lang w:val="en-US"/>
+              </w:rPr>
+              <w:t>afectada</w:t>
+            </w:r>
+            <w:proofErr w:type="spellEnd"/>
+            <w:r>
+              <w:rPr>
+                <w:b/>
+                <w:bCs/>
+                <w:color w:val="3D3D5C"/>
                 <w:sz w:val="16"/>
                 <w:szCs w:val="16"/>
+                <w:lang w:val="en-US"/>
+              </w:rPr>
+              <w:t xml:space="preserve">(s): </w:t>
+            </w:r>
+            <w:r>
+              <w:rPr>
+                <w:color w:val="8B5E00"/>
+                <w:sz w:val="16"/>
+                <w:szCs w:val="16"/>
+                <w:lang w:val="en-US"/>
+              </w:rPr>
+              <w:t>{{FINDING_4_ACCOUNTS</w:t>
+            </w:r>
+            <w:r>
+              <w:rPr>
+                <w:color w:val="8B5E00"/>
+                <w:sz w:val="16"/>
+                <w:szCs w:val="16"/>
+                <w:lang w:val="en-US"/>
+              </w:rPr>
+              <w:t>}}</w:t>
+            </w:r>
+            <w:r>
+              <w:rPr>
+                <w:b/>
+                <w:bCs/>
+                <w:color w:val="3D3D5C"/>
+                <w:sz w:val="16"/>
+                <w:szCs w:val="16"/>
+                <w:lang w:val="en-US"/>
+              </w:rPr>
+              <w:t xml:space="preserve"> |</w:t>
+            </w:r>
+            <w:r>
+              <w:rPr>
+                <w:b/>
+                <w:bCs/>
+                <w:color w:val="3D3D5C"/>
+                <w:sz w:val="16"/>
+                <w:szCs w:val="16"/>
+                <w:lang w:val="en-US"/>
+              </w:rPr>
+              <w:t xml:space="preserve">   Impacto: </w:t>
+            </w:r>
+            <w:r>
+              <w:rPr>
+                <w:color w:val="8B5E00"/>
+                <w:sz w:val="16"/>
+                <w:szCs w:val="16"/>
+                <w:lang w:val="en-US"/>
               </w:rPr>
               <w:t>{{FINDING_4_IMPACT}}</w:t>
             </w:r>
@@ -14059,11 +14107,17 @@
     <w:p>
       <w:pPr>
         <w:spacing w:before="60" w:after="60"/>
+        <w:rPr>
+          <w:lang w:val="en-US"/>
+        </w:rPr>
       </w:pPr>
     </w:p>
     <w:p>
       <w:pPr>
         <w:spacing w:before="120" w:after="40"/>
+        <w:rPr>
+          <w:lang w:val="en-US"/>
+        </w:rPr>
       </w:pPr>
     </w:p>
     <w:p>
@@ -14081,17 +14135,7 @@
           <w:sz w:val="22"/>
           <w:szCs w:val="22"/>
         </w:rPr>
-        <w:t>6.3 Hallazgos</w:t>
-      </w:r>
-      <w:r>
-        <w:rPr>
-          <w:b/>
-          <w:bCs/>
-          <w:color w:val="2E4A7A"/>
-          <w:sz w:val="22"/>
-          <w:szCs w:val="22"/>
-        </w:rPr>
-        <w:t xml:space="preserve"> Positivos / Oportunidades</w:t>
+        <w:t>6.3 Hallazgos Positivos / Oportunidades</w:t>
       </w:r>
     </w:p>
     <w:p>
@@ -14121,12 +14165,6 @@
         <w:gridCol w:w="8722"/>
       </w:tblGrid>
       <w:tr>
-        <w:tblPrEx>
-          <w:tblCellMar>
-            <w:top w:w="0" w:type="dxa"/>
-            <w:bottom w:w="0" w:type="dxa"/>
-          </w:tblCellMar>
-        </w:tblPrEx>
         <w:tc>
           <w:tcPr>
             <w:tcW w:w="300" w:type="dxa"/>
@@ -14194,11 +14232,17 @@
             </w:tcMar>
           </w:tcPr>
           <w:p>
+            <w:pPr>
+              <w:rPr>
+                <w:lang w:val="en-US"/>
+              </w:rPr>
+            </w:pPr>
             <w:r>
               <w:rPr>
                 <w:b/>
                 <w:bCs/>
                 <w:color w:val="1A7A4A"/>
+                <w:lang w:val="en-US"/>
               </w:rPr>
               <w:t>{{FINDING_5_TITLE}}</w:t>
             </w:r>
@@ -14206,6 +14250,9 @@
           <w:p>
             <w:pPr>
               <w:spacing w:before="40"/>
+              <w:rPr>
+                <w:lang w:val="en-US"/>
+              </w:rPr>
             </w:pPr>
             <w:r>
               <w:rPr>
@@ -14214,6 +14261,7 @@
                 <w:color w:val="8B5E00"/>
                 <w:sz w:val="18"/>
                 <w:szCs w:val="18"/>
+                <w:lang w:val="en-US"/>
               </w:rPr>
               <w:t>{{FINDING_5_BODY}}</w:t>
             </w:r>
@@ -14221,7 +14269,11 @@
           <w:p>
             <w:pPr>
               <w:spacing w:before="40"/>
-            </w:pPr>
+              <w:rPr>
+                <w:lang w:val="en-US"/>
+              </w:rPr>
+            </w:pPr>
+            <w:proofErr w:type="spellStart"/>
             <w:r>
               <w:rPr>
                 <w:b/>
@@ -14229,25 +14281,11 @@
                 <w:color w:val="3D3D5C"/>
                 <w:sz w:val="16"/>
                 <w:szCs w:val="16"/>
-              </w:rPr>
-              <w:t xml:space="preserve">Cuenta(s) afectada(s): </w:t>
-            </w:r>
-            <w:r>
-              <w:rPr>
-                <w:color w:val="8B5E00"/>
-                <w:sz w:val="16"/>
-                <w:szCs w:val="16"/>
-              </w:rPr>
-              <w:t>{{FINDING_5_ACCOUNTS</w:t>
-            </w:r>
-            <w:r>
-              <w:rPr>
-                <w:color w:val="8B5E00"/>
-                <w:sz w:val="16"/>
-                <w:szCs w:val="16"/>
-              </w:rPr>
-              <w:t>}}</w:t>
-            </w:r>
+                <w:lang w:val="en-US"/>
+              </w:rPr>
+              <w:t>Cuenta</w:t>
+            </w:r>
+            <w:proofErr w:type="spellEnd"/>
             <w:r>
               <w:rPr>
                 <w:b/>
@@ -14255,9 +14293,11 @@
                 <w:color w:val="3D3D5C"/>
                 <w:sz w:val="16"/>
                 <w:szCs w:val="16"/>
-              </w:rPr>
-              <w:t xml:space="preserve"> |</w:t>
-            </w:r>
+                <w:lang w:val="en-US"/>
+              </w:rPr>
+              <w:t xml:space="preserve">(s) </w:t>
+            </w:r>
+            <w:proofErr w:type="spellStart"/>
             <w:r>
               <w:rPr>
                 <w:b/>
@@ -14265,14 +14305,90 @@
                 <w:color w:val="3D3D5C"/>
                 <w:sz w:val="16"/>
                 <w:szCs w:val="16"/>
-              </w:rPr>
-              <w:t xml:space="preserve">   Impacto: </w:t>
-            </w:r>
-            <w:r>
-              <w:rPr>
-                <w:color w:val="8B5E00"/>
+                <w:lang w:val="en-US"/>
+              </w:rPr>
+              <w:t>afectada</w:t>
+            </w:r>
+            <w:proofErr w:type="spellEnd"/>
+            <w:r>
+              <w:rPr>
+                <w:b/>
+                <w:bCs/>
+                <w:color w:val="3D3D5C"/>
                 <w:sz w:val="16"/>
                 <w:szCs w:val="16"/>
+                <w:lang w:val="en-US"/>
+              </w:rPr>
+              <w:t>(s</w:t>
+            </w:r>
+            <w:proofErr w:type="gramStart"/>
+            <w:r>
+              <w:rPr>
+                <w:b/>
+                <w:bCs/>
+                <w:color w:val="3D3D5C"/>
+                <w:sz w:val="16"/>
+                <w:szCs w:val="16"/>
+                <w:lang w:val="en-US"/>
+              </w:rPr>
+              <w:t xml:space="preserve">): </w:t>
+            </w:r>
+            <w:r>
+              <w:rPr>
+                <w:color w:val="8B5E00"/>
+                <w:sz w:val="16"/>
+                <w:szCs w:val="16"/>
+                <w:lang w:val="en-US"/>
+              </w:rPr>
+              <w:t>{{</w:t>
+            </w:r>
+            <w:proofErr w:type="gramEnd"/>
+            <w:r>
+              <w:rPr>
+                <w:color w:val="8B5E00"/>
+                <w:sz w:val="16"/>
+                <w:szCs w:val="16"/>
+                <w:lang w:val="en-US"/>
+              </w:rPr>
+              <w:t>FINDING_5_ACCOUNTS</w:t>
+            </w:r>
+            <w:r>
+              <w:rPr>
+                <w:color w:val="8B5E00"/>
+                <w:sz w:val="16"/>
+                <w:szCs w:val="16"/>
+                <w:lang w:val="en-US"/>
+              </w:rPr>
+              <w:t>}}</w:t>
+            </w:r>
+            <w:r>
+              <w:rPr>
+                <w:b/>
+                <w:bCs/>
+                <w:color w:val="3D3D5C"/>
+                <w:sz w:val="16"/>
+                <w:szCs w:val="16"/>
+                <w:lang w:val="en-US"/>
+              </w:rPr>
+              <w:t xml:space="preserve"> |</w:t>
+            </w:r>
+            <w:r>
+              <w:rPr>
+                <w:b/>
+                <w:bCs/>
+                <w:color w:val="3D3D5C"/>
+                <w:sz w:val="16"/>
+                <w:szCs w:val="16"/>
+                <w:lang w:val="en-US"/>
+              </w:rPr>
+              <w:t xml:space="preserve">   Impacto: </w:t>
+            </w:r>
+            <w:r>
+              <w:rPr>
+                <w:color w:val="8B5E00"/>
+                <w:sz w:val="16"/>
+                <w:szCs w:val="16"/>
+                <w:lang w:val="en-US"/>
               </w:rPr>
               <w:t>{{FINDING_5_IMPACT}}</w:t>
             </w:r>
@@ -14283,11 +14399,17 @@
     <w:p>
       <w:pPr>
         <w:spacing w:before="60" w:after="60"/>
+        <w:rPr>
+          <w:lang w:val="en-US"/>
+        </w:rPr>
       </w:pPr>
     </w:p>
     <w:p>
       <w:pPr>
         <w:spacing w:before="120" w:after="40"/>
+        <w:rPr>
+          <w:lang w:val="en-US"/>
+        </w:rPr>
       </w:pPr>
     </w:p>
     <w:p>
@@ -14305,17 +14427,7 @@
           <w:sz w:val="22"/>
           <w:szCs w:val="22"/>
         </w:rPr>
-        <w:t>6.4 Hallazgos</w:t>
-      </w:r>
-      <w:r>
-        <w:rPr>
-          <w:b/>
-          <w:bCs/>
-          <w:color w:val="2E4A7A"/>
-          <w:sz w:val="22"/>
-          <w:szCs w:val="22"/>
-        </w:rPr>
-        <w:t xml:space="preserve"> Informativos</w:t>
+        <w:t>6.4 Hallazgos Informativos</w:t>
       </w:r>
     </w:p>
     <w:p>
@@ -14345,12 +14457,6 @@
         <w:gridCol w:w="8589"/>
       </w:tblGrid>
       <w:tr>
-        <w:tblPrEx>
-          <w:tblCellMar>
-            <w:top w:w="0" w:type="dxa"/>
-            <w:bottom w:w="0" w:type="dxa"/>
-          </w:tblCellMar>
-        </w:tblPrEx>
         <w:tc>
           <w:tcPr>
             <w:tcW w:w="300" w:type="dxa"/>
@@ -14418,11 +14524,17 @@
             </w:tcMar>
           </w:tcPr>
           <w:p>
+            <w:pPr>
+              <w:rPr>
+                <w:lang w:val="en-US"/>
+              </w:rPr>
+            </w:pPr>
             <w:r>
               <w:rPr>
                 <w:b/>
                 <w:bCs/>
                 <w:color w:val="2E4A7A"/>
+                <w:lang w:val="en-US"/>
               </w:rPr>
               <w:t>{{FINDING_6_TITLE}}</w:t>
             </w:r>
@@ -14430,6 +14542,9 @@
           <w:p>
             <w:pPr>
               <w:spacing w:before="40"/>
+              <w:rPr>
+                <w:lang w:val="en-US"/>
+              </w:rPr>
             </w:pPr>
             <w:r>
               <w:rPr>
@@ -14438,6 +14553,7 @@
                 <w:color w:val="8B5E00"/>
                 <w:sz w:val="18"/>
                 <w:szCs w:val="18"/>
+                <w:lang w:val="en-US"/>
               </w:rPr>
               <w:t>{{FINDING_6_BODY}}</w:t>
             </w:r>
@@ -14445,7 +14561,11 @@
           <w:p>
             <w:pPr>
               <w:spacing w:before="40"/>
-            </w:pPr>
+              <w:rPr>
+                <w:lang w:val="en-US"/>
+              </w:rPr>
+            </w:pPr>
+            <w:proofErr w:type="spellStart"/>
             <w:r>
               <w:rPr>
                 <w:b/>
@@ -14453,25 +14573,11 @@
                 <w:color w:val="3D3D5C"/>
                 <w:sz w:val="16"/>
                 <w:szCs w:val="16"/>
-              </w:rPr>
-              <w:t xml:space="preserve">Cuenta(s) afectada(s): </w:t>
-            </w:r>
-            <w:r>
-              <w:rPr>
-                <w:color w:val="8B5E00"/>
-                <w:sz w:val="16"/>
-                <w:szCs w:val="16"/>
-              </w:rPr>
-              <w:t>{{FINDING_6_ACCOUNTS</w:t>
-            </w:r>
-            <w:r>
-              <w:rPr>
-                <w:color w:val="8B5E00"/>
-                <w:sz w:val="16"/>
-                <w:szCs w:val="16"/>
-              </w:rPr>
-              <w:t>}}</w:t>
-            </w:r>
+                <w:lang w:val="en-US"/>
+              </w:rPr>
+              <w:t>Cuenta</w:t>
+            </w:r>
+            <w:proofErr w:type="spellEnd"/>
             <w:r>
               <w:rPr>
                 <w:b/>
@@ -14479,9 +14585,11 @@
                 <w:color w:val="3D3D5C"/>
                 <w:sz w:val="16"/>
                 <w:szCs w:val="16"/>
-              </w:rPr>
-              <w:t xml:space="preserve"> |</w:t>
-            </w:r>
+                <w:lang w:val="en-US"/>
+              </w:rPr>
+              <w:t xml:space="preserve">(s) </w:t>
+            </w:r>
+            <w:proofErr w:type="spellStart"/>
             <w:r>
               <w:rPr>
                 <w:b/>
@@ -14489,14 +14597,90 @@
                 <w:color w:val="3D3D5C"/>
                 <w:sz w:val="16"/>
                 <w:szCs w:val="16"/>
-              </w:rPr>
-              <w:t xml:space="preserve">   Impacto: </w:t>
-            </w:r>
-            <w:r>
-              <w:rPr>
-                <w:color w:val="8B5E00"/>
+                <w:lang w:val="en-US"/>
+              </w:rPr>
+              <w:t>afectada</w:t>
+            </w:r>
+            <w:proofErr w:type="spellEnd"/>
+            <w:r>
+              <w:rPr>
+                <w:b/>
+                <w:bCs/>
+                <w:color w:val="3D3D5C"/>
                 <w:sz w:val="16"/>
                 <w:szCs w:val="16"/>
+                <w:lang w:val="en-US"/>
+              </w:rPr>
+              <w:t>(s</w:t>
+            </w:r>
+            <w:proofErr w:type="gramStart"/>
+            <w:r>
+              <w:rPr>
+                <w:b/>
+                <w:bCs/>
+                <w:color w:val="3D3D5C"/>
+                <w:sz w:val="16"/>
+                <w:szCs w:val="16"/>
+                <w:lang w:val="en-US"/>
+              </w:rPr>
+              <w:t xml:space="preserve">): </w:t>
+            </w:r>
+            <w:r>
+              <w:rPr>
+                <w:color w:val="8B5E00"/>
+                <w:sz w:val="16"/>
+                <w:szCs w:val="16"/>
+                <w:lang w:val="en-US"/>
+              </w:rPr>
+              <w:t>{{</w:t>
+            </w:r>
+            <w:proofErr w:type="gramEnd"/>
+            <w:r>
+              <w:rPr>
+                <w:color w:val="8B5E00"/>
+                <w:sz w:val="16"/>
+                <w:szCs w:val="16"/>
+                <w:lang w:val="en-US"/>
+              </w:rPr>
+              <w:t>FINDING_6_ACCOUNTS</w:t>
+            </w:r>
+            <w:r>
+              <w:rPr>
+                <w:color w:val="8B5E00"/>
+                <w:sz w:val="16"/>
+                <w:szCs w:val="16"/>
+                <w:lang w:val="en-US"/>
+              </w:rPr>
+              <w:t>}}</w:t>
+            </w:r>
+            <w:r>
+              <w:rPr>
+                <w:b/>
+                <w:bCs/>
+                <w:color w:val="3D3D5C"/>
+                <w:sz w:val="16"/>
+                <w:szCs w:val="16"/>
+                <w:lang w:val="en-US"/>
+              </w:rPr>
+              <w:t xml:space="preserve"> |</w:t>
+            </w:r>
+            <w:r>
+              <w:rPr>
+                <w:b/>
+                <w:bCs/>
+                <w:color w:val="3D3D5C"/>
+                <w:sz w:val="16"/>
+                <w:szCs w:val="16"/>
+                <w:lang w:val="en-US"/>
+              </w:rPr>
+              <w:t xml:space="preserve">   Impacto: </w:t>
+            </w:r>
+            <w:r>
+              <w:rPr>
+                <w:color w:val="8B5E00"/>
+                <w:sz w:val="16"/>
+                <w:szCs w:val="16"/>
+                <w:lang w:val="en-US"/>
               </w:rPr>
               <w:t>{{FINDING_6_IMPACT}}</w:t>
             </w:r>
@@ -14507,6 +14691,9 @@
     <w:p>
       <w:pPr>
         <w:spacing w:before="60" w:after="60"/>
+        <w:rPr>
+          <w:lang w:val="en-US"/>
+        </w:rPr>
       </w:pPr>
     </w:p>
     <w:tbl>
@@ -14531,12 +14718,6 @@
         <w:gridCol w:w="8589"/>
       </w:tblGrid>
       <w:tr>
-        <w:tblPrEx>
-          <w:tblCellMar>
-            <w:top w:w="0" w:type="dxa"/>
-            <w:bottom w:w="0" w:type="dxa"/>
-          </w:tblCellMar>
-        </w:tblPrEx>
         <w:tc>
           <w:tcPr>
             <w:tcW w:w="300" w:type="dxa"/>
@@ -14604,11 +14785,17 @@
             </w:tcMar>
           </w:tcPr>
           <w:p>
+            <w:pPr>
+              <w:rPr>
+                <w:lang w:val="en-US"/>
+              </w:rPr>
+            </w:pPr>
             <w:r>
               <w:rPr>
                 <w:b/>
                 <w:bCs/>
                 <w:color w:val="2E4A7A"/>
+                <w:lang w:val="en-US"/>
               </w:rPr>
               <w:t>{{FINDING_7_TITLE}}</w:t>
             </w:r>
@@ -14616,6 +14803,9 @@
           <w:p>
             <w:pPr>
               <w:spacing w:before="40"/>
+              <w:rPr>
+                <w:lang w:val="en-US"/>
+              </w:rPr>
             </w:pPr>
             <w:r>
               <w:rPr>
@@ -14624,6 +14814,7 @@
                 <w:color w:val="8B5E00"/>
                 <w:sz w:val="18"/>
                 <w:szCs w:val="18"/>
+                <w:lang w:val="en-US"/>
               </w:rPr>
               <w:t>{{FINDING_7_BODY}}</w:t>
             </w:r>
@@ -14631,7 +14822,11 @@
           <w:p>
             <w:pPr>
               <w:spacing w:before="40"/>
-            </w:pPr>
+              <w:rPr>
+                <w:lang w:val="en-US"/>
+              </w:rPr>
+            </w:pPr>
+            <w:proofErr w:type="spellStart"/>
             <w:r>
               <w:rPr>
                 <w:b/>
@@ -14639,25 +14834,11 @@
                 <w:color w:val="3D3D5C"/>
                 <w:sz w:val="16"/>
                 <w:szCs w:val="16"/>
-              </w:rPr>
-              <w:t xml:space="preserve">Cuenta(s) afectada(s): </w:t>
-            </w:r>
-            <w:r>
-              <w:rPr>
-                <w:color w:val="8B5E00"/>
-                <w:sz w:val="16"/>
-                <w:szCs w:val="16"/>
-              </w:rPr>
-              <w:t>{{FINDING_7_ACCOUNTS</w:t>
-            </w:r>
-            <w:r>
-              <w:rPr>
-                <w:color w:val="8B5E00"/>
-                <w:sz w:val="16"/>
-                <w:szCs w:val="16"/>
-              </w:rPr>
-              <w:t>}}</w:t>
-            </w:r>
+                <w:lang w:val="en-US"/>
+              </w:rPr>
+              <w:t>Cuenta</w:t>
+            </w:r>
+            <w:proofErr w:type="spellEnd"/>
             <w:r>
               <w:rPr>
                 <w:b/>
@@ -14665,9 +14846,11 @@
                 <w:color w:val="3D3D5C"/>
                 <w:sz w:val="16"/>
                 <w:szCs w:val="16"/>
-              </w:rPr>
-              <w:t xml:space="preserve"> |</w:t>
-            </w:r>
+                <w:lang w:val="en-US"/>
+              </w:rPr>
+              <w:t xml:space="preserve">(s) </w:t>
+            </w:r>
+            <w:proofErr w:type="spellStart"/>
             <w:r>
               <w:rPr>
                 <w:b/>
@@ -14675,14 +14858,90 @@
                 <w:color w:val="3D3D5C"/>
                 <w:sz w:val="16"/>
                 <w:szCs w:val="16"/>
-              </w:rPr>
-              <w:t xml:space="preserve">   Impacto: </w:t>
-            </w:r>
-            <w:r>
-              <w:rPr>
-                <w:color w:val="8B5E00"/>
+                <w:lang w:val="en-US"/>
+              </w:rPr>
+              <w:t>afectada</w:t>
+            </w:r>
+            <w:proofErr w:type="spellEnd"/>
+            <w:r>
+              <w:rPr>
+                <w:b/>
+                <w:bCs/>
+                <w:color w:val="3D3D5C"/>
                 <w:sz w:val="16"/>
                 <w:szCs w:val="16"/>
+                <w:lang w:val="en-US"/>
+              </w:rPr>
+              <w:t>(s</w:t>
+            </w:r>
+            <w:proofErr w:type="gramStart"/>
+            <w:r>
+              <w:rPr>
+                <w:b/>
+                <w:bCs/>
+                <w:color w:val="3D3D5C"/>
+                <w:sz w:val="16"/>
+                <w:szCs w:val="16"/>
+                <w:lang w:val="en-US"/>
+              </w:rPr>
+              <w:t xml:space="preserve">): </w:t>
+            </w:r>
+            <w:r>
+              <w:rPr>
+                <w:color w:val="8B5E00"/>
+                <w:sz w:val="16"/>
+                <w:szCs w:val="16"/>
+                <w:lang w:val="en-US"/>
+              </w:rPr>
+              <w:t>{{</w:t>
+            </w:r>
+            <w:proofErr w:type="gramEnd"/>
+            <w:r>
+              <w:rPr>
+                <w:color w:val="8B5E00"/>
+                <w:sz w:val="16"/>
+                <w:szCs w:val="16"/>
+                <w:lang w:val="en-US"/>
+              </w:rPr>
+              <w:t>FINDING_7_ACCOUNTS</w:t>
+            </w:r>
+            <w:r>
+              <w:rPr>
+                <w:color w:val="8B5E00"/>
+                <w:sz w:val="16"/>
+                <w:szCs w:val="16"/>
+                <w:lang w:val="en-US"/>
+              </w:rPr>
+              <w:t>}}</w:t>
+            </w:r>
+            <w:r>
+              <w:rPr>
+                <w:b/>
+                <w:bCs/>
+                <w:color w:val="3D3D5C"/>
+                <w:sz w:val="16"/>
+                <w:szCs w:val="16"/>
+                <w:lang w:val="en-US"/>
+              </w:rPr>
+              <w:t xml:space="preserve"> |</w:t>
+            </w:r>
+            <w:r>
+              <w:rPr>
+                <w:b/>
+                <w:bCs/>
+                <w:color w:val="3D3D5C"/>
+                <w:sz w:val="16"/>
+                <w:szCs w:val="16"/>
+                <w:lang w:val="en-US"/>
+              </w:rPr>
+              <w:t xml:space="preserve">   Impacto: </w:t>
+            </w:r>
+            <w:r>
+              <w:rPr>
+                <w:color w:val="8B5E00"/>
+                <w:sz w:val="16"/>
+                <w:szCs w:val="16"/>
+                <w:lang w:val="en-US"/>
               </w:rPr>
               <w:t>{{FINDING_7_IMPACT}}</w:t>
             </w:r>
@@ -14693,16 +14952,30 @@
     <w:p>
       <w:pPr>
         <w:spacing w:before="60" w:after="60"/>
+        <w:rPr>
+          <w:lang w:val="en-US"/>
+        </w:rPr>
       </w:pPr>
     </w:p>
     <w:p>
+      <w:pPr>
+        <w:rPr>
+          <w:lang w:val="en-US"/>
+        </w:rPr>
+      </w:pPr>
       <w:r>
+        <w:rPr>
+          <w:lang w:val="en-US"/>
+        </w:rPr>
         <w:br w:type="page"/>
       </w:r>
     </w:p>
     <w:p>
       <w:pPr>
         <w:spacing w:before="200"/>
+        <w:rPr>
+          <w:lang w:val="en-US"/>
+        </w:rPr>
       </w:pPr>
     </w:p>
     <w:p>
@@ -14716,6 +14989,7 @@
           <w:color w:val="FFFFFF"/>
           <w:sz w:val="26"/>
           <w:szCs w:val="26"/>
+          <w:lang w:val="en-US"/>
         </w:rPr>
         <w:t xml:space="preserve">  </w:t>
       </w:r>
@@ -14776,17 +15050,7 @@
           <w:sz w:val="22"/>
           <w:szCs w:val="22"/>
         </w:rPr>
-        <w:t>7.1 Cumplimiento</w:t>
-      </w:r>
-      <w:r>
-        <w:rPr>
-          <w:b/>
-          <w:bCs/>
-          <w:color w:val="2E4A7A"/>
-          <w:sz w:val="22"/>
-          <w:szCs w:val="22"/>
-        </w:rPr>
-        <w:t xml:space="preserve"> NIC 34 — </w:t>
+        <w:t xml:space="preserve">7.1 Cumplimiento NIC 34 — </w:t>
       </w:r>
       <w:proofErr w:type="spellStart"/>
       <w:r>
@@ -14830,12 +15094,6 @@
         <w:gridCol w:w="2808"/>
       </w:tblGrid>
       <w:tr>
-        <w:tblPrEx>
-          <w:tblCellMar>
-            <w:top w:w="0" w:type="dxa"/>
-            <w:bottom w:w="0" w:type="dxa"/>
-          </w:tblCellMar>
-        </w:tblPrEx>
         <w:trPr>
           <w:tblHeader/>
         </w:trPr>
@@ -14977,12 +15235,6 @@
         </w:tc>
       </w:tr>
       <w:tr>
-        <w:tblPrEx>
-          <w:tblCellMar>
-            <w:top w:w="0" w:type="dxa"/>
-            <w:bottom w:w="0" w:type="dxa"/>
-          </w:tblCellMar>
-        </w:tblPrEx>
         <w:tc>
           <w:tcPr>
             <w:tcW w:w="3000" w:type="dxa"/>
@@ -15106,12 +15358,6 @@
         </w:tc>
       </w:tr>
       <w:tr>
-        <w:tblPrEx>
-          <w:tblCellMar>
-            <w:top w:w="0" w:type="dxa"/>
-            <w:bottom w:w="0" w:type="dxa"/>
-          </w:tblCellMar>
-        </w:tblPrEx>
         <w:tc>
           <w:tcPr>
             <w:tcW w:w="3000" w:type="dxa"/>
@@ -15235,12 +15481,6 @@
         </w:tc>
       </w:tr>
       <w:tr>
-        <w:tblPrEx>
-          <w:tblCellMar>
-            <w:top w:w="0" w:type="dxa"/>
-            <w:bottom w:w="0" w:type="dxa"/>
-          </w:tblCellMar>
-        </w:tblPrEx>
         <w:tc>
           <w:tcPr>
             <w:tcW w:w="3000" w:type="dxa"/>
@@ -15364,12 +15604,6 @@
         </w:tc>
       </w:tr>
       <w:tr>
-        <w:tblPrEx>
-          <w:tblCellMar>
-            <w:top w:w="0" w:type="dxa"/>
-            <w:bottom w:w="0" w:type="dxa"/>
-          </w:tblCellMar>
-        </w:tblPrEx>
         <w:tc>
           <w:tcPr>
             <w:tcW w:w="3000" w:type="dxa"/>
@@ -15493,12 +15727,6 @@
         </w:tc>
       </w:tr>
       <w:tr>
-        <w:tblPrEx>
-          <w:tblCellMar>
-            <w:top w:w="0" w:type="dxa"/>
-            <w:bottom w:w="0" w:type="dxa"/>
-          </w:tblCellMar>
-        </w:tblPrEx>
         <w:tc>
           <w:tcPr>
             <w:tcW w:w="3000" w:type="dxa"/>
@@ -15622,12 +15850,6 @@
         </w:tc>
       </w:tr>
       <w:tr>
-        <w:tblPrEx>
-          <w:tblCellMar>
-            <w:top w:w="0" w:type="dxa"/>
-            <w:bottom w:w="0" w:type="dxa"/>
-          </w:tblCellMar>
-        </w:tblPrEx>
         <w:tc>
           <w:tcPr>
             <w:tcW w:w="3000" w:type="dxa"/>
@@ -15751,12 +15973,6 @@
         </w:tc>
       </w:tr>
       <w:tr>
-        <w:tblPrEx>
-          <w:tblCellMar>
-            <w:top w:w="0" w:type="dxa"/>
-            <w:bottom w:w="0" w:type="dxa"/>
-          </w:tblCellMar>
-        </w:tblPrEx>
         <w:tc>
           <w:tcPr>
             <w:tcW w:w="3000" w:type="dxa"/>
@@ -15880,12 +16096,6 @@
         </w:tc>
       </w:tr>
       <w:tr>
-        <w:tblPrEx>
-          <w:tblCellMar>
-            <w:top w:w="0" w:type="dxa"/>
-            <w:bottom w:w="0" w:type="dxa"/>
-          </w:tblCellMar>
-        </w:tblPrEx>
         <w:tc>
           <w:tcPr>
             <w:tcW w:w="3000" w:type="dxa"/>
@@ -16034,17 +16244,7 @@
           <w:sz w:val="22"/>
           <w:szCs w:val="22"/>
         </w:rPr>
-        <w:t>7.2 Borrador</w:t>
-      </w:r>
-      <w:r>
-        <w:rPr>
-          <w:b/>
-          <w:bCs/>
-          <w:color w:val="2E4A7A"/>
-          <w:sz w:val="22"/>
-          <w:szCs w:val="22"/>
-        </w:rPr>
-        <w:t xml:space="preserve"> de Notas Explicativas</w:t>
+        <w:t>7.2 Borrador de Notas Explicativas</w:t>
       </w:r>
     </w:p>
     <w:p>
@@ -16070,6 +16270,14 @@
       </w:r>
       <w:r>
         <w:rPr>
+          <w:b/>
+          <w:bCs/>
+          <w:color w:val="8B5E00"/>
+        </w:rPr>
+        <w:t xml:space="preserve"> ~~</w:t>
+      </w:r>
+      <w:r>
+        <w:rPr>
           <w:i/>
           <w:iCs/>
           <w:color w:val="8B5E00"/>
@@ -16077,6 +16285,16 @@
           <w:szCs w:val="18"/>
         </w:rPr>
         <w:t xml:space="preserve"> — NOTA 2 — BASES DE PREPARACIÓN: Borrador generado por Agente 3 + Agente 5. Políticas contables aplicadas, cambios respecto al período anterior, supuestos críticos.</w:t>
+      </w:r>
+      <w:r>
+        <w:rPr>
+          <w:i/>
+          <w:iCs/>
+          <w:color w:val="8B5E00"/>
+          <w:sz w:val="18"/>
+          <w:szCs w:val="18"/>
+        </w:rPr>
+        <w:t xml:space="preserve"> ~~</w:t>
       </w:r>
     </w:p>
     <w:p>
@@ -16097,13 +16315,53 @@
       </w:r>
       <w:r>
         <w:rPr>
+          <w:b/>
+          <w:bCs/>
+          <w:color w:val="8B5E00"/>
+        </w:rPr>
+        <w:t xml:space="preserve"> ~~</w:t>
+      </w:r>
+      <w:r>
+        <w:rPr>
           <w:i/>
           <w:iCs/>
           <w:color w:val="8B5E00"/>
           <w:sz w:val="18"/>
           <w:szCs w:val="18"/>
         </w:rPr>
-        <w:t xml:space="preserve"> — NOTA 3 — VALOR RAZONABLE: Técnicas de valoración, jerarquía de niveles, movimientos entre niveles.</w:t>
+        <w:t xml:space="preserve"> — NOTA 3 — VALOR RAZONABLE: Técnicas de valoración, jerarquía de niveles, movimientos entre </w:t>
+      </w:r>
+      <w:proofErr w:type="gramStart"/>
+      <w:r>
+        <w:rPr>
+          <w:i/>
+          <w:iCs/>
+          <w:color w:val="8B5E00"/>
+          <w:sz w:val="18"/>
+          <w:szCs w:val="18"/>
+        </w:rPr>
+        <w:t>niveles.</w:t>
+      </w:r>
+      <w:r>
+        <w:rPr>
+          <w:i/>
+          <w:iCs/>
+          <w:color w:val="8B5E00"/>
+          <w:sz w:val="18"/>
+          <w:szCs w:val="18"/>
+        </w:rPr>
+        <w:t>~</w:t>
+      </w:r>
+      <w:proofErr w:type="gramEnd"/>
+      <w:r>
+        <w:rPr>
+          <w:i/>
+          <w:iCs/>
+          <w:color w:val="8B5E00"/>
+          <w:sz w:val="18"/>
+          <w:szCs w:val="18"/>
+        </w:rPr>
+        <w:t>~</w:t>
       </w:r>
     </w:p>
     <w:p>
@@ -16124,6 +16382,14 @@
       </w:r>
       <w:r>
         <w:rPr>
+          <w:b/>
+          <w:bCs/>
+          <w:color w:val="8B5E00"/>
+        </w:rPr>
+        <w:t xml:space="preserve"> ~~</w:t>
+      </w:r>
+      <w:r>
+        <w:rPr>
           <w:i/>
           <w:iCs/>
           <w:color w:val="8B5E00"/>
@@ -16131,6 +16397,16 @@
           <w:szCs w:val="18"/>
         </w:rPr>
         <w:t xml:space="preserve"> — NOTA 4 — PARTES RELACIONADAS: Transacciones con la Sociedad Administradora. Comisiones de administración pagadas/causadas.</w:t>
+      </w:r>
+      <w:r>
+        <w:rPr>
+          <w:i/>
+          <w:iCs/>
+          <w:color w:val="8B5E00"/>
+          <w:sz w:val="18"/>
+          <w:szCs w:val="18"/>
+        </w:rPr>
+        <w:t xml:space="preserve"> ~~</w:t>
       </w:r>
     </w:p>
     <w:p>
@@ -16148,6 +16424,14 @@
           <w:color w:val="8B5E00"/>
         </w:rPr>
         <w:t>{{NOTE_RISKS}}</w:t>
+      </w:r>
+      <w:r>
+        <w:rPr>
+          <w:b/>
+          <w:bCs/>
+          <w:color w:val="8B5E00"/>
+        </w:rPr>
+        <w:t xml:space="preserve"> ~~</w:t>
       </w:r>
       <w:r>
         <w:rPr>
@@ -16181,6 +16465,16 @@
         </w:rPr>
         <w:t xml:space="preserve"> regulatorio y modelo interno. Riesgo ASG.</w:t>
       </w:r>
+      <w:r>
+        <w:rPr>
+          <w:i/>
+          <w:iCs/>
+          <w:color w:val="8B5E00"/>
+          <w:sz w:val="18"/>
+          <w:szCs w:val="18"/>
+        </w:rPr>
+        <w:t xml:space="preserve"> ~~</w:t>
+      </w:r>
     </w:p>
     <w:p>
       <w:pPr>
@@ -16202,17 +16496,7 @@
           <w:sz w:val="22"/>
           <w:szCs w:val="22"/>
         </w:rPr>
-        <w:t>7.3 Materialidad</w:t>
-      </w:r>
-      <w:r>
-        <w:rPr>
-          <w:b/>
-          <w:bCs/>
-          <w:color w:val="2E4A7A"/>
-          <w:sz w:val="22"/>
-          <w:szCs w:val="22"/>
-        </w:rPr>
-        <w:t xml:space="preserve"> — Umbrales Aplicados</w:t>
+        <w:t>7.3 Materialidad — Umbrales Aplicados</w:t>
       </w:r>
     </w:p>
     <w:p>
@@ -16244,12 +16528,6 @@
         <w:gridCol w:w="2585"/>
       </w:tblGrid>
       <w:tr>
-        <w:tblPrEx>
-          <w:tblCellMar>
-            <w:top w:w="0" w:type="dxa"/>
-            <w:bottom w:w="0" w:type="dxa"/>
-          </w:tblCellMar>
-        </w:tblPrEx>
         <w:trPr>
           <w:tblHeader/>
         </w:trPr>
@@ -16391,12 +16669,6 @@
         </w:tc>
       </w:tr>
       <w:tr>
-        <w:tblPrEx>
-          <w:tblCellMar>
-            <w:top w:w="0" w:type="dxa"/>
-            <w:bottom w:w="0" w:type="dxa"/>
-          </w:tblCellMar>
-        </w:tblPrEx>
         <w:tc>
           <w:tcPr>
             <w:tcW w:w="2800" w:type="dxa"/>
@@ -16520,12 +16792,6 @@
         </w:tc>
       </w:tr>
       <w:tr>
-        <w:tblPrEx>
-          <w:tblCellMar>
-            <w:top w:w="0" w:type="dxa"/>
-            <w:bottom w:w="0" w:type="dxa"/>
-          </w:tblCellMar>
-        </w:tblPrEx>
         <w:tc>
           <w:tcPr>
             <w:tcW w:w="2800" w:type="dxa"/>
@@ -16649,12 +16915,6 @@
         </w:tc>
       </w:tr>
       <w:tr>
-        <w:tblPrEx>
-          <w:tblCellMar>
-            <w:top w:w="0" w:type="dxa"/>
-            <w:bottom w:w="0" w:type="dxa"/>
-          </w:tblCellMar>
-        </w:tblPrEx>
         <w:tc>
           <w:tcPr>
             <w:tcW w:w="2800" w:type="dxa"/>
@@ -16778,12 +17038,6 @@
         </w:tc>
       </w:tr>
       <w:tr>
-        <w:tblPrEx>
-          <w:tblCellMar>
-            <w:top w:w="0" w:type="dxa"/>
-            <w:bottom w:w="0" w:type="dxa"/>
-          </w:tblCellMar>
-        </w:tblPrEx>
         <w:tc>
           <w:tcPr>
             <w:tcW w:w="2800" w:type="dxa"/>
@@ -16993,17 +17247,7 @@
           <w:sz w:val="22"/>
           <w:szCs w:val="22"/>
         </w:rPr>
-        <w:t>8.1 Métricas</w:t>
-      </w:r>
-      <w:r>
-        <w:rPr>
-          <w:b/>
-          <w:bCs/>
-          <w:color w:val="2E4A7A"/>
-          <w:sz w:val="22"/>
-          <w:szCs w:val="22"/>
-        </w:rPr>
-        <w:t xml:space="preserve"> de Riesgo de Mercado</w:t>
+        <w:t>8.1 Métricas de Riesgo de Mercado</w:t>
       </w:r>
     </w:p>
     <w:p>
@@ -17036,12 +17280,6 @@
         <w:gridCol w:w="3192"/>
       </w:tblGrid>
       <w:tr>
-        <w:tblPrEx>
-          <w:tblCellMar>
-            <w:top w:w="0" w:type="dxa"/>
-            <w:bottom w:w="0" w:type="dxa"/>
-          </w:tblCellMar>
-        </w:tblPrEx>
         <w:tc>
           <w:tcPr>
             <w:tcW w:w="3122" w:type="dxa"/>
@@ -17305,12 +17543,6 @@
         <w:gridCol w:w="2429"/>
       </w:tblGrid>
       <w:tr>
-        <w:tblPrEx>
-          <w:tblCellMar>
-            <w:top w:w="0" w:type="dxa"/>
-            <w:bottom w:w="0" w:type="dxa"/>
-          </w:tblCellMar>
-        </w:tblPrEx>
         <w:trPr>
           <w:tblHeader/>
         </w:trPr>
@@ -17486,12 +17718,6 @@
         </w:tc>
       </w:tr>
       <w:tr>
-        <w:tblPrEx>
-          <w:tblCellMar>
-            <w:top w:w="0" w:type="dxa"/>
-            <w:bottom w:w="0" w:type="dxa"/>
-          </w:tblCellMar>
-        </w:tblPrEx>
         <w:tc>
           <w:tcPr>
             <w:tcW w:w="2800" w:type="dxa"/>
@@ -17615,12 +17841,6 @@
         </w:tc>
       </w:tr>
       <w:tr>
-        <w:tblPrEx>
-          <w:tblCellMar>
-            <w:top w:w="0" w:type="dxa"/>
-            <w:bottom w:w="0" w:type="dxa"/>
-          </w:tblCellMar>
-        </w:tblPrEx>
         <w:tc>
           <w:tcPr>
             <w:tcW w:w="2800" w:type="dxa"/>
@@ -17744,12 +17964,6 @@
         </w:tc>
       </w:tr>
       <w:tr>
-        <w:tblPrEx>
-          <w:tblCellMar>
-            <w:top w:w="0" w:type="dxa"/>
-            <w:bottom w:w="0" w:type="dxa"/>
-          </w:tblCellMar>
-        </w:tblPrEx>
         <w:tc>
           <w:tcPr>
             <w:tcW w:w="2800" w:type="dxa"/>
@@ -17873,12 +18087,6 @@
         </w:tc>
       </w:tr>
       <w:tr>
-        <w:tblPrEx>
-          <w:tblCellMar>
-            <w:top w:w="0" w:type="dxa"/>
-            <w:bottom w:w="0" w:type="dxa"/>
-          </w:tblCellMar>
-        </w:tblPrEx>
         <w:tc>
           <w:tcPr>
             <w:tcW w:w="2800" w:type="dxa"/>
@@ -18002,12 +18210,6 @@
         </w:tc>
       </w:tr>
       <w:tr>
-        <w:tblPrEx>
-          <w:tblCellMar>
-            <w:top w:w="0" w:type="dxa"/>
-            <w:bottom w:w="0" w:type="dxa"/>
-          </w:tblCellMar>
-        </w:tblPrEx>
         <w:tc>
           <w:tcPr>
             <w:tcW w:w="2800" w:type="dxa"/>
@@ -18156,17 +18358,7 @@
           <w:sz w:val="22"/>
           <w:szCs w:val="22"/>
         </w:rPr>
-        <w:t>8.2 Escenarios</w:t>
-      </w:r>
-      <w:r>
-        <w:rPr>
-          <w:b/>
-          <w:bCs/>
-          <w:color w:val="2E4A7A"/>
-          <w:sz w:val="22"/>
-          <w:szCs w:val="22"/>
-        </w:rPr>
-        <w:t xml:space="preserve"> de Estrés</w:t>
+        <w:t>8.2 Escenarios de Estrés</w:t>
       </w:r>
     </w:p>
     <w:p>
@@ -18198,12 +18390,6 @@
         <w:gridCol w:w="2276"/>
       </w:tblGrid>
       <w:tr>
-        <w:tblPrEx>
-          <w:tblCellMar>
-            <w:top w:w="0" w:type="dxa"/>
-            <w:bottom w:w="0" w:type="dxa"/>
-          </w:tblCellMar>
-        </w:tblPrEx>
         <w:trPr>
           <w:tblHeader/>
         </w:trPr>
@@ -18345,12 +18531,6 @@
         </w:tc>
       </w:tr>
       <w:tr>
-        <w:tblPrEx>
-          <w:tblCellMar>
-            <w:top w:w="0" w:type="dxa"/>
-            <w:bottom w:w="0" w:type="dxa"/>
-          </w:tblCellMar>
-        </w:tblPrEx>
         <w:tc>
           <w:tcPr>
             <w:tcW w:w="1500" w:type="dxa"/>
@@ -18474,12 +18654,6 @@
         </w:tc>
       </w:tr>
       <w:tr>
-        <w:tblPrEx>
-          <w:tblCellMar>
-            <w:top w:w="0" w:type="dxa"/>
-            <w:bottom w:w="0" w:type="dxa"/>
-          </w:tblCellMar>
-        </w:tblPrEx>
         <w:tc>
           <w:tcPr>
             <w:tcW w:w="1500" w:type="dxa"/>
@@ -18603,12 +18777,6 @@
         </w:tc>
       </w:tr>
       <w:tr>
-        <w:tblPrEx>
-          <w:tblCellMar>
-            <w:top w:w="0" w:type="dxa"/>
-            <w:bottom w:w="0" w:type="dxa"/>
-          </w:tblCellMar>
-        </w:tblPrEx>
         <w:tc>
           <w:tcPr>
             <w:tcW w:w="1500" w:type="dxa"/>
@@ -18757,17 +18925,7 @@
           <w:sz w:val="22"/>
           <w:szCs w:val="22"/>
         </w:rPr>
-        <w:t>8.3 Riesgo</w:t>
-      </w:r>
-      <w:r>
-        <w:rPr>
-          <w:b/>
-          <w:bCs/>
-          <w:color w:val="2E4A7A"/>
-          <w:sz w:val="22"/>
-          <w:szCs w:val="22"/>
-        </w:rPr>
-        <w:t xml:space="preserve"> de Liquidez — IRL</w:t>
+        <w:t>8.3 Riesgo de Liquidez — IRL</w:t>
       </w:r>
     </w:p>
     <w:p>
@@ -18793,6 +18951,14 @@
       </w:r>
       <w:r>
         <w:rPr>
+          <w:b/>
+          <w:bCs/>
+          <w:color w:val="8B5E00"/>
+        </w:rPr>
+        <w:t xml:space="preserve"> ~~</w:t>
+      </w:r>
+      <w:r>
+        <w:rPr>
           <w:i/>
           <w:iCs/>
           <w:color w:val="8B5E00"/>
@@ -18800,6 +18966,16 @@
           <w:szCs w:val="18"/>
         </w:rPr>
         <w:t xml:space="preserve"> — Agente 4: IRL al cierre del período. Banda temporal de 1 semana. Cumplimiento de límites. Flujos de entrada/salida proyectados.</w:t>
+      </w:r>
+      <w:r>
+        <w:rPr>
+          <w:i/>
+          <w:iCs/>
+          <w:color w:val="8B5E00"/>
+          <w:sz w:val="18"/>
+          <w:szCs w:val="18"/>
+        </w:rPr>
+        <w:t xml:space="preserve"> ~~</w:t>
       </w:r>
     </w:p>
     <w:p>
@@ -18822,17 +18998,7 @@
           <w:sz w:val="22"/>
           <w:szCs w:val="22"/>
         </w:rPr>
-        <w:t>8.4 Riesgo</w:t>
-      </w:r>
-      <w:r>
-        <w:rPr>
-          <w:b/>
-          <w:bCs/>
-          <w:color w:val="2E4A7A"/>
-          <w:sz w:val="22"/>
-          <w:szCs w:val="22"/>
-        </w:rPr>
-        <w:t xml:space="preserve"> ASG</w:t>
+        <w:t>8.4 Riesgo ASG</w:t>
       </w:r>
     </w:p>
     <w:p>
@@ -18858,6 +19024,14 @@
       </w:r>
       <w:r>
         <w:rPr>
+          <w:b/>
+          <w:bCs/>
+          <w:color w:val="8B5E00"/>
+        </w:rPr>
+        <w:t xml:space="preserve"> ~~</w:t>
+      </w:r>
+      <w:r>
+        <w:rPr>
           <w:i/>
           <w:iCs/>
           <w:color w:val="8B5E00"/>
@@ -18865,6 +19039,16 @@
           <w:szCs w:val="18"/>
         </w:rPr>
         <w:t xml:space="preserve"> — Agente 4: Nivel de exposición al riesgo ASG. Principio de Relevancia y Proporcionalidad aplicados. Cumplimiento Circular Externa 005 de 2024 SFC.</w:t>
+      </w:r>
+      <w:r>
+        <w:rPr>
+          <w:i/>
+          <w:iCs/>
+          <w:color w:val="8B5E00"/>
+          <w:sz w:val="18"/>
+          <w:szCs w:val="18"/>
+        </w:rPr>
+        <w:t xml:space="preserve"> ~~</w:t>
       </w:r>
     </w:p>
     <w:p>
@@ -18948,17 +19132,7 @@
           <w:sz w:val="22"/>
           <w:szCs w:val="22"/>
         </w:rPr>
-        <w:t>9.1 Conclusiones</w:t>
-      </w:r>
-      <w:r>
-        <w:rPr>
-          <w:b/>
-          <w:bCs/>
-          <w:color w:val="2E4A7A"/>
-          <w:sz w:val="22"/>
-          <w:szCs w:val="22"/>
-        </w:rPr>
-        <w:t xml:space="preserve"> Principales</w:t>
+        <w:t>9.1 Conclusiones Principales</w:t>
       </w:r>
     </w:p>
     <w:p>
@@ -18984,6 +19158,14 @@
       </w:r>
       <w:r>
         <w:rPr>
+          <w:b/>
+          <w:bCs/>
+          <w:color w:val="8B5E00"/>
+        </w:rPr>
+        <w:t xml:space="preserve"> ~~</w:t>
+      </w:r>
+      <w:r>
+        <w:rPr>
           <w:i/>
           <w:iCs/>
           <w:color w:val="8B5E00"/>
@@ -18991,6 +19173,16 @@
           <w:szCs w:val="18"/>
         </w:rPr>
         <w:t xml:space="preserve"> — Agente 5: Párrafo ejecutivo de 3-5 oraciones con los puntos más relevantes del período. Orientado a tomadores de decisión no técnicos.</w:t>
+      </w:r>
+      <w:r>
+        <w:rPr>
+          <w:i/>
+          <w:iCs/>
+          <w:color w:val="8B5E00"/>
+          <w:sz w:val="18"/>
+          <w:szCs w:val="18"/>
+        </w:rPr>
+        <w:t xml:space="preserve"> ~~</w:t>
       </w:r>
     </w:p>
     <w:p>
@@ -19013,17 +19205,7 @@
           <w:sz w:val="22"/>
           <w:szCs w:val="22"/>
         </w:rPr>
-        <w:t>9.2 Indicadores</w:t>
-      </w:r>
-      <w:r>
-        <w:rPr>
-          <w:b/>
-          <w:bCs/>
-          <w:color w:val="2E4A7A"/>
-          <w:sz w:val="22"/>
-          <w:szCs w:val="22"/>
-        </w:rPr>
-        <w:t xml:space="preserve"> Clave de Desempeño</w:t>
+        <w:t>9.2 Indicadores Clave de Desempeño</w:t>
       </w:r>
     </w:p>
     <w:p>
@@ -19056,12 +19238,6 @@
         <w:gridCol w:w="3210"/>
       </w:tblGrid>
       <w:tr>
-        <w:tblPrEx>
-          <w:tblCellMar>
-            <w:top w:w="0" w:type="dxa"/>
-            <w:bottom w:w="0" w:type="dxa"/>
-          </w:tblCellMar>
-        </w:tblPrEx>
         <w:tc>
           <w:tcPr>
             <w:tcW w:w="3548" w:type="dxa"/>
@@ -19357,17 +19533,7 @@
           <w:sz w:val="22"/>
           <w:szCs w:val="22"/>
         </w:rPr>
-        <w:t>9.3 Temas</w:t>
-      </w:r>
-      <w:r>
-        <w:rPr>
-          <w:b/>
-          <w:bCs/>
-          <w:color w:val="2E4A7A"/>
-          <w:sz w:val="22"/>
-          <w:szCs w:val="22"/>
-        </w:rPr>
-        <w:t xml:space="preserve"> Prioritarios para la Junta</w:t>
+        <w:t>9.3 Temas Prioritarios para la Junta</w:t>
       </w:r>
     </w:p>
     <w:p>
@@ -19447,17 +19613,7 @@
           <w:sz w:val="22"/>
           <w:szCs w:val="22"/>
         </w:rPr>
-        <w:t>9.4 Próximos</w:t>
-      </w:r>
-      <w:r>
-        <w:rPr>
-          <w:b/>
-          <w:bCs/>
-          <w:color w:val="2E4A7A"/>
-          <w:sz w:val="22"/>
-          <w:szCs w:val="22"/>
-        </w:rPr>
-        <w:t xml:space="preserve"> Pasos y Recomendaciones</w:t>
+        <w:t>9.4 Próximos Pasos y Recomendaciones</w:t>
       </w:r>
     </w:p>
     <w:p>
@@ -19483,6 +19639,14 @@
       </w:r>
       <w:r>
         <w:rPr>
+          <w:b/>
+          <w:bCs/>
+          <w:color w:val="8B5E00"/>
+        </w:rPr>
+        <w:t xml:space="preserve"> ~~</w:t>
+      </w:r>
+      <w:r>
+        <w:rPr>
           <w:i/>
           <w:iCs/>
           <w:color w:val="8B5E00"/>
@@ -19490,6 +19654,16 @@
           <w:szCs w:val="18"/>
         </w:rPr>
         <w:t xml:space="preserve"> — Agente 5: Acciones recomendadas basadas en los hallazgos. Seguimiento de alertas identificadas. Validaciones pendientes por el equipo contable.</w:t>
+      </w:r>
+      <w:r>
+        <w:rPr>
+          <w:i/>
+          <w:iCs/>
+          <w:color w:val="8B5E00"/>
+          <w:sz w:val="18"/>
+          <w:szCs w:val="18"/>
+        </w:rPr>
+        <w:t xml:space="preserve"> ~~</w:t>
       </w:r>
       <w:r>
         <w:br w:type="page"/>
@@ -19508,17 +19682,7 @@
           <w:szCs w:val="26"/>
         </w:rPr>
         <w:lastRenderedPageBreak/>
-        <w:t>10 VALIDACIÓN</w:t>
-      </w:r>
-      <w:r>
-        <w:rPr>
-          <w:b/>
-          <w:bCs/>
-          <w:color w:val="FFFFFF"/>
-          <w:sz w:val="26"/>
-          <w:szCs w:val="26"/>
-        </w:rPr>
-        <w:t xml:space="preserve"> Y APROBACIÓN</w:t>
+        <w:t>10 VALIDACIÓN Y APROBACIÓN</w:t>
       </w:r>
     </w:p>
     <w:p>
@@ -19534,7 +19698,7 @@
           <w:sz w:val="18"/>
           <w:szCs w:val="18"/>
         </w:rPr>
-        <w:t xml:space="preserve">  Flujo de revisión humana — Agente 6 (Revisor Inteligente) + Contadores</w:t>
+        <w:t xml:space="preserve">  Flujo de revisión humana — Agente 6 (Revisor Inteligente)</w:t>
       </w:r>
     </w:p>
     <w:p>
@@ -19611,12 +19775,6 @@
         <w:gridCol w:w="2745"/>
       </w:tblGrid>
       <w:tr>
-        <w:tblPrEx>
-          <w:tblCellMar>
-            <w:top w:w="0" w:type="dxa"/>
-            <w:bottom w:w="0" w:type="dxa"/>
-          </w:tblCellMar>
-        </w:tblPrEx>
         <w:trPr>
           <w:tblHeader/>
         </w:trPr>
@@ -19758,12 +19916,6 @@
         </w:tc>
       </w:tr>
       <w:tr>
-        <w:tblPrEx>
-          <w:tblCellMar>
-            <w:top w:w="0" w:type="dxa"/>
-            <w:bottom w:w="0" w:type="dxa"/>
-          </w:tblCellMar>
-        </w:tblPrEx>
         <w:tc>
           <w:tcPr>
             <w:tcW w:w="3400" w:type="dxa"/>
@@ -19887,12 +20039,6 @@
         </w:tc>
       </w:tr>
       <w:tr>
-        <w:tblPrEx>
-          <w:tblCellMar>
-            <w:top w:w="0" w:type="dxa"/>
-            <w:bottom w:w="0" w:type="dxa"/>
-          </w:tblCellMar>
-        </w:tblPrEx>
         <w:tc>
           <w:tcPr>
             <w:tcW w:w="3400" w:type="dxa"/>
@@ -20016,12 +20162,6 @@
         </w:tc>
       </w:tr>
       <w:tr>
-        <w:tblPrEx>
-          <w:tblCellMar>
-            <w:top w:w="0" w:type="dxa"/>
-            <w:bottom w:w="0" w:type="dxa"/>
-          </w:tblCellMar>
-        </w:tblPrEx>
         <w:tc>
           <w:tcPr>
             <w:tcW w:w="3400" w:type="dxa"/>
@@ -20145,12 +20285,6 @@
         </w:tc>
       </w:tr>
       <w:tr>
-        <w:tblPrEx>
-          <w:tblCellMar>
-            <w:top w:w="0" w:type="dxa"/>
-            <w:bottom w:w="0" w:type="dxa"/>
-          </w:tblCellMar>
-        </w:tblPrEx>
         <w:tc>
           <w:tcPr>
             <w:tcW w:w="3400" w:type="dxa"/>
@@ -20274,12 +20408,6 @@
         </w:tc>
       </w:tr>
       <w:tr>
-        <w:tblPrEx>
-          <w:tblCellMar>
-            <w:top w:w="0" w:type="dxa"/>
-            <w:bottom w:w="0" w:type="dxa"/>
-          </w:tblCellMar>
-        </w:tblPrEx>
         <w:tc>
           <w:tcPr>
             <w:tcW w:w="3400" w:type="dxa"/>
@@ -20403,12 +20531,6 @@
         </w:tc>
       </w:tr>
       <w:tr>
-        <w:tblPrEx>
-          <w:tblCellMar>
-            <w:top w:w="0" w:type="dxa"/>
-            <w:bottom w:w="0" w:type="dxa"/>
-          </w:tblCellMar>
-        </w:tblPrEx>
         <w:tc>
           <w:tcPr>
             <w:tcW w:w="3400" w:type="dxa"/>
@@ -20532,12 +20654,6 @@
         </w:tc>
       </w:tr>
       <w:tr>
-        <w:tblPrEx>
-          <w:tblCellMar>
-            <w:top w:w="0" w:type="dxa"/>
-            <w:bottom w:w="0" w:type="dxa"/>
-          </w:tblCellMar>
-        </w:tblPrEx>
         <w:tc>
           <w:tcPr>
             <w:tcW w:w="3400" w:type="dxa"/>
@@ -20661,12 +20777,6 @@
         </w:tc>
       </w:tr>
       <w:tr>
-        <w:tblPrEx>
-          <w:tblCellMar>
-            <w:top w:w="0" w:type="dxa"/>
-            <w:bottom w:w="0" w:type="dxa"/>
-          </w:tblCellMar>
-        </w:tblPrEx>
         <w:tc>
           <w:tcPr>
             <w:tcW w:w="3400" w:type="dxa"/>
@@ -20815,17 +20925,7 @@
           <w:sz w:val="22"/>
           <w:szCs w:val="22"/>
         </w:rPr>
-        <w:t>10.2 Observaciones</w:t>
-      </w:r>
-      <w:r>
-        <w:rPr>
-          <w:b/>
-          <w:bCs/>
-          <w:color w:val="2E4A7A"/>
-          <w:sz w:val="22"/>
-          <w:szCs w:val="22"/>
-        </w:rPr>
-        <w:t xml:space="preserve"> del Revisor IA</w:t>
+        <w:t>10.2 Observaciones del Revisor IA</w:t>
       </w:r>
     </w:p>
     <w:p>
@@ -20848,6 +20948,24 @@
           <w:color w:val="8B5E00"/>
         </w:rPr>
         <w:t>{{AI_REVIEWER_NOTES}}</w:t>
+      </w:r>
+      <w:r>
+        <w:rPr>
+          <w:b/>
+          <w:bCs/>
+          <w:color w:val="8B5E00"/>
+        </w:rPr>
+        <w:t xml:space="preserve"> </w:t>
+      </w:r>
+      <w:r>
+        <w:rPr>
+          <w:i/>
+          <w:iCs/>
+          <w:color w:val="8B5E00"/>
+          <w:sz w:val="18"/>
+          <w:szCs w:val="18"/>
+        </w:rPr>
+        <w:t>~~</w:t>
       </w:r>
       <w:r>
         <w:rPr>
@@ -20881,223 +20999,27 @@
         </w:rPr>
         <w:t xml:space="preserve"> — referencias cruzadas.</w:t>
       </w:r>
-    </w:p>
-    <w:p>
-      <w:pPr>
-        <w:spacing w:before="200" w:after="80"/>
-      </w:pPr>
-    </w:p>
-    <w:p>
-      <w:pPr>
-        <w:pBdr>
-          <w:bottom w:val="single" w:sz="8" w:space="1" w:color="1B2A4A"/>
-        </w:pBdr>
-      </w:pPr>
-    </w:p>
-    <w:p>
-      <w:pPr>
-        <w:spacing w:before="80" w:after="80"/>
-      </w:pPr>
-    </w:p>
-    <w:p>
-      <w:pPr>
-        <w:spacing w:after="60"/>
-      </w:pPr>
-      <w:r>
-        <w:rPr>
-          <w:b/>
-          <w:bCs/>
-          <w:color w:val="1B2A4A"/>
-          <w:sz w:val="22"/>
-          <w:szCs w:val="22"/>
-        </w:rPr>
-        <w:t>CERTIFICACIÓN Y APROBACIÓN HUMANA</w:t>
-      </w:r>
-    </w:p>
-    <w:p>
-      <w:pPr>
-        <w:spacing w:after="160"/>
-      </w:pPr>
       <w:r>
         <w:rPr>
           <w:i/>
           <w:iCs/>
-          <w:color w:val="3D3D5C"/>
+          <w:color w:val="8B5E00"/>
           <w:sz w:val="18"/>
           <w:szCs w:val="18"/>
         </w:rPr>
-        <w:t xml:space="preserve">Los suscritos, habiendo revisado el presente análisis generado por el sistema </w:t>
+        <w:t xml:space="preserve"> </w:t>
       </w:r>
-      <w:proofErr w:type="spellStart"/>
       <w:r>
         <w:rPr>
           <w:i/>
           <w:iCs/>
-          <w:color w:val="3D3D5C"/>
+          <w:color w:val="8B5E00"/>
           <w:sz w:val="18"/>
           <w:szCs w:val="18"/>
         </w:rPr>
-        <w:t>CreditIQ</w:t>
-      </w:r>
-      <w:proofErr w:type="spellEnd"/>
-      <w:r>
-        <w:rPr>
-          <w:i/>
-          <w:iCs/>
-          <w:color w:val="3D3D5C"/>
-          <w:sz w:val="18"/>
-          <w:szCs w:val="18"/>
-        </w:rPr>
-        <w:t>, certificamos que las cifras han sido verificadas contra los libros contables y que el contenido narrativo refleja fielmente la situación financiera del Fondo al período indicado.</w:t>
+        <w:t>~~</w:t>
       </w:r>
     </w:p>
-    <w:tbl>
-      <w:tblPr>
-        <w:tblW w:w="9638" w:type="dxa"/>
-        <w:tblBorders>
-          <w:top w:val="single" w:sz="4" w:space="0" w:color="auto"/>
-          <w:left w:val="single" w:sz="4" w:space="0" w:color="auto"/>
-          <w:bottom w:val="single" w:sz="4" w:space="0" w:color="auto"/>
-          <w:right w:val="single" w:sz="4" w:space="0" w:color="auto"/>
-          <w:insideH w:val="single" w:sz="4" w:space="0" w:color="auto"/>
-          <w:insideV w:val="single" w:sz="4" w:space="0" w:color="auto"/>
-        </w:tblBorders>
-        <w:tblCellMar>
-          <w:left w:w="10" w:type="dxa"/>
-          <w:right w:w="10" w:type="dxa"/>
-        </w:tblCellMar>
-        <w:tblLook w:val="04A0" w:firstRow="1" w:lastRow="0" w:firstColumn="1" w:lastColumn="0" w:noHBand="0" w:noVBand="1"/>
-      </w:tblPr>
-      <w:tblGrid>
-        <w:gridCol w:w="4618"/>
-        <w:gridCol w:w="402"/>
-        <w:gridCol w:w="4618"/>
-      </w:tblGrid>
-      <w:tr>
-        <w:tblPrEx>
-          <w:tblCellMar>
-            <w:top w:w="0" w:type="dxa"/>
-            <w:bottom w:w="0" w:type="dxa"/>
-          </w:tblCellMar>
-        </w:tblPrEx>
-        <w:tc>
-          <w:tcPr>
-            <w:tcW w:w="4600" w:type="dxa"/>
-            <w:tcBorders>
-              <w:top w:val="none" w:sz="0" w:space="0" w:color="FFFFFF"/>
-              <w:left w:val="none" w:sz="0" w:space="0" w:color="FFFFFF"/>
-              <w:bottom w:val="single" w:sz="4" w:space="0" w:color="3D3D5C"/>
-              <w:right w:val="none" w:sz="0" w:space="0" w:color="FFFFFF"/>
-            </w:tcBorders>
-            <w:tcMar>
-              <w:top w:w="200" w:type="dxa"/>
-              <w:left w:w="0" w:type="dxa"/>
-              <w:bottom w:w="80" w:type="dxa"/>
-              <w:right w:w="0" w:type="dxa"/>
-            </w:tcMar>
-          </w:tcPr>
-          <w:p>
-            <w:r>
-              <w:t>{{REP_LEGAL_NAME}}</w:t>
-            </w:r>
-          </w:p>
-          <w:p>
-            <w:pPr>
-              <w:spacing w:before="40"/>
-            </w:pPr>
-            <w:r>
-              <w:rPr>
-                <w:b/>
-                <w:bCs/>
-                <w:color w:val="2E4A7A"/>
-                <w:sz w:val="18"/>
-                <w:szCs w:val="18"/>
-              </w:rPr>
-              <w:t>Representante Legal</w:t>
-            </w:r>
-          </w:p>
-          <w:p>
-            <w:r>
-              <w:rPr>
-                <w:color w:val="3D3D5C"/>
-                <w:sz w:val="16"/>
-                <w:szCs w:val="16"/>
-              </w:rPr>
-              <w:t>Fecha: {{REP_LEGAL_DATE}}</w:t>
-            </w:r>
-          </w:p>
-        </w:tc>
-        <w:tc>
-          <w:tcPr>
-            <w:tcW w:w="400" w:type="dxa"/>
-            <w:tcBorders>
-              <w:top w:val="none" w:sz="0" w:space="0" w:color="FFFFFF"/>
-              <w:left w:val="none" w:sz="0" w:space="0" w:color="FFFFFF"/>
-              <w:bottom w:val="none" w:sz="0" w:space="0" w:color="FFFFFF"/>
-              <w:right w:val="none" w:sz="0" w:space="0" w:color="FFFFFF"/>
-            </w:tcBorders>
-          </w:tcPr>
-          <w:p/>
-        </w:tc>
-        <w:tc>
-          <w:tcPr>
-            <w:tcW w:w="4600" w:type="dxa"/>
-            <w:tcBorders>
-              <w:top w:val="none" w:sz="0" w:space="0" w:color="FFFFFF"/>
-              <w:left w:val="none" w:sz="0" w:space="0" w:color="FFFFFF"/>
-              <w:bottom w:val="single" w:sz="4" w:space="0" w:color="3D3D5C"/>
-              <w:right w:val="none" w:sz="0" w:space="0" w:color="FFFFFF"/>
-            </w:tcBorders>
-            <w:tcMar>
-              <w:top w:w="200" w:type="dxa"/>
-              <w:left w:w="0" w:type="dxa"/>
-              <w:bottom w:w="80" w:type="dxa"/>
-              <w:right w:w="0" w:type="dxa"/>
-            </w:tcMar>
-          </w:tcPr>
-          <w:p>
-            <w:r>
-              <w:t>{{CONTADOR_NAME}}</w:t>
-            </w:r>
-          </w:p>
-          <w:p>
-            <w:pPr>
-              <w:spacing w:before="40"/>
-            </w:pPr>
-            <w:r>
-              <w:rPr>
-                <w:b/>
-                <w:bCs/>
-                <w:color w:val="2E4A7A"/>
-                <w:sz w:val="18"/>
-                <w:szCs w:val="18"/>
-              </w:rPr>
-              <w:t>Contador Público</w:t>
-            </w:r>
-          </w:p>
-          <w:p>
-            <w:r>
-              <w:rPr>
-                <w:color w:val="3D3D5C"/>
-                <w:sz w:val="16"/>
-                <w:szCs w:val="16"/>
-              </w:rPr>
-              <w:t>T.P. {{CONTADOR_TP}}</w:t>
-            </w:r>
-          </w:p>
-          <w:p>
-            <w:r>
-              <w:rPr>
-                <w:color w:val="3D3D5C"/>
-                <w:sz w:val="16"/>
-                <w:szCs w:val="16"/>
-              </w:rPr>
-              <w:t>Fecha: {{CONTADOR_DATE}}</w:t>
-            </w:r>
-          </w:p>
-        </w:tc>
-      </w:tr>
-    </w:tbl>
     <w:p>
       <w:pPr>
         <w:spacing w:before="120" w:after="80"/>
@@ -21173,10 +21095,10 @@
       </w:r>
     </w:p>
     <w:sectPr>
-      <w:headerReference w:type="default" r:id="rId7"/>
-      <w:footerReference w:type="even" r:id="rId8"/>
-      <w:footerReference w:type="default" r:id="rId9"/>
-      <w:footerReference w:type="first" r:id="rId10"/>
+      <w:headerReference w:type="default" r:id="rId8"/>
+      <w:footerReference w:type="even" r:id="rId9"/>
+      <w:footerReference w:type="default" r:id="rId10"/>
+      <w:footerReference w:type="first" r:id="rId11"/>
       <w:pgSz w:w="11906" w:h="16838"/>
       <w:pgMar w:top="907" w:right="1134" w:bottom="907" w:left="1134" w:header="708" w:footer="708" w:gutter="0"/>
       <w:cols w:space="720"/>

</xml_diff>